<commit_message>
Build print edition of Book One from the combined file
- Restore chapter 13, which was missing from the combined file
- Unify style in chapters 2-5 (long dashes, «ليس… بل») and update cross-references
- All tables right-to-left; chapter reference lists moved to one list at the end
- Chapter introductions; table of contents field, page breaks, page numbers

Co-Authored-By: Claude Opus 5.5 <noreply@anthropic.com>
Claude-Session: https://claude.ai/code/session_01LhGpaEd3xGUonrLS6HmYox
</commit_message>
<xml_diff>
--- a/chapters/الفهارس_النهائية.docx
+++ b/chapters/الفهارس_النهائية.docx
@@ -21,4039 +21,6 @@
           <w:rtl/>
         </w:rPr>
         <w:t xml:space="preserve">الفهارس</w:t>
-      </w:r>
-    </w:p>
-    <w:p>
-      <w:pPr>
-        <w:bidi/>
-        <w:rPr>
-          <w:rFonts w:ascii="Sakkal Majalla" w:hAnsi="Sakkal Majalla" w:cs="Sakkal Majalla"/>
-        </w:rPr>
-      </w:pPr>
-    </w:p>
-    <w:p>
-      <w:pPr>
-        <w:pBdr>
-          <w:bottom w:val="single" w:sz="8" w:space="0" w:color="BF8F00"/>
-        </w:pBdr>
-        <w:bidi/>
-        <w:rPr>
-          <w:rFonts w:ascii="Sakkal Majalla" w:hAnsi="Sakkal Majalla" w:cs="Sakkal Majalla"/>
-        </w:rPr>
-      </w:pPr>
-      <w:r>
-        <w:rPr>
-          <w:rFonts w:ascii="Sakkal Majalla" w:hAnsi="Sakkal Majalla" w:cs="Sakkal Majalla"/>
-          <w:b/>
-          <w:bCs/>
-          <w:color w:val="1F3864"/>
-          <w:sz w:val="34"/>
-          <w:szCs w:val="34"/>
-          <w:rtl/>
-        </w:rPr>
-        <w:t xml:space="preserve">فهرس المحتويات</w:t>
-      </w:r>
-    </w:p>
-    <w:p>
-      <w:pPr>
-        <w:bidi/>
-        <w:rPr>
-          <w:rFonts w:ascii="Sakkal Majalla" w:hAnsi="Sakkal Majalla" w:cs="Sakkal Majalla"/>
-        </w:rPr>
-      </w:pPr>
-    </w:p>
-    <w:p>
-      <w:pPr>
-        <w:bidi/>
-        <w:rPr>
-          <w:rFonts w:ascii="Sakkal Majalla" w:hAnsi="Sakkal Majalla" w:cs="Sakkal Majalla"/>
-        </w:rPr>
-      </w:pPr>
-      <w:r>
-        <w:rPr>
-          <w:rFonts w:ascii="Sakkal Majalla" w:hAnsi="Sakkal Majalla" w:cs="Sakkal Majalla"/>
-          <w:b/>
-          <w:bCs/>
-          <w:color w:val="156082"/>
-          <w:sz w:val="30"/>
-          <w:szCs w:val="30"/>
-          <w:rtl/>
-        </w:rPr>
-        <w:t xml:space="preserve">المقدمة</w:t>
-      </w:r>
-    </w:p>
-    <w:p>
-      <w:pPr>
-        <w:bidi/>
-        <w:rPr>
-          <w:rFonts w:ascii="Sakkal Majalla" w:hAnsi="Sakkal Majalla" w:cs="Sakkal Majalla"/>
-        </w:rPr>
-      </w:pPr>
-      <w:r>
-        <w:rPr>
-          <w:rFonts w:ascii="Sakkal Majalla" w:hAnsi="Sakkal Majalla" w:cs="Sakkal Majalla"/>
-          <w:color w:val="000000"/>
-          <w:sz w:val="30"/>
-          <w:szCs w:val="30"/>
-          <w:rtl/>
-        </w:rPr>
-        <w:t xml:space="preserve">سؤال قبل الأسئلة</w:t>
-      </w:r>
-    </w:p>
-    <w:p>
-      <w:pPr>
-        <w:bidi/>
-        <w:rPr>
-          <w:rFonts w:ascii="Sakkal Majalla" w:hAnsi="Sakkal Majalla" w:cs="Sakkal Majalla"/>
-        </w:rPr>
-      </w:pPr>
-      <w:r>
-        <w:rPr>
-          <w:rFonts w:ascii="Sakkal Majalla" w:hAnsi="Sakkal Majalla" w:cs="Sakkal Majalla"/>
-          <w:color w:val="000000"/>
-          <w:sz w:val="30"/>
-          <w:szCs w:val="30"/>
-          <w:rtl/>
-        </w:rPr>
-        <w:t xml:space="preserve">التشخيص: ثلاث مفارقات في حقل الإدارة الإسلامية</w:t>
-      </w:r>
-    </w:p>
-    <w:p>
-      <w:pPr>
-        <w:bidi/>
-        <w:rPr>
-          <w:rFonts w:ascii="Sakkal Majalla" w:hAnsi="Sakkal Majalla" w:cs="Sakkal Majalla"/>
-        </w:rPr>
-      </w:pPr>
-      <w:r>
-        <w:rPr>
-          <w:rFonts w:ascii="Sakkal Majalla" w:hAnsi="Sakkal Majalla" w:cs="Sakkal Majalla"/>
-          <w:color w:val="000000"/>
-          <w:sz w:val="30"/>
-          <w:szCs w:val="30"/>
-          <w:rtl/>
-        </w:rPr>
-        <w:t xml:space="preserve">لماذا الآن؟</w:t>
-      </w:r>
-    </w:p>
-    <w:p>
-      <w:pPr>
-        <w:bidi/>
-        <w:rPr>
-          <w:rFonts w:ascii="Sakkal Majalla" w:hAnsi="Sakkal Majalla" w:cs="Sakkal Majalla"/>
-        </w:rPr>
-      </w:pPr>
-      <w:r>
-        <w:rPr>
-          <w:rFonts w:ascii="Sakkal Majalla" w:hAnsi="Sakkal Majalla" w:cs="Sakkal Majalla"/>
-          <w:color w:val="000000"/>
-          <w:sz w:val="30"/>
-          <w:szCs w:val="30"/>
-          <w:rtl/>
-        </w:rPr>
-        <w:t xml:space="preserve">ما يقدّمه هذا الكتاب وما لا يدّعيه</w:t>
-      </w:r>
-    </w:p>
-    <w:p>
-      <w:pPr>
-        <w:bidi/>
-        <w:rPr>
-          <w:rFonts w:ascii="Sakkal Majalla" w:hAnsi="Sakkal Majalla" w:cs="Sakkal Majalla"/>
-        </w:rPr>
-      </w:pPr>
-      <w:r>
-        <w:rPr>
-          <w:rFonts w:ascii="Sakkal Majalla" w:hAnsi="Sakkal Majalla" w:cs="Sakkal Majalla"/>
-          <w:color w:val="000000"/>
-          <w:sz w:val="30"/>
-          <w:szCs w:val="30"/>
-          <w:rtl/>
-        </w:rPr>
-        <w:t xml:space="preserve">ثلاث أدوات في قلب المنهج</w:t>
-      </w:r>
-    </w:p>
-    <w:p>
-      <w:pPr>
-        <w:bidi/>
-        <w:rPr>
-          <w:rFonts w:ascii="Sakkal Majalla" w:hAnsi="Sakkal Majalla" w:cs="Sakkal Majalla"/>
-        </w:rPr>
-      </w:pPr>
-      <w:r>
-        <w:rPr>
-          <w:rFonts w:ascii="Sakkal Majalla" w:hAnsi="Sakkal Majalla" w:cs="Sakkal Majalla"/>
-          <w:color w:val="000000"/>
-          <w:sz w:val="30"/>
-          <w:szCs w:val="30"/>
-          <w:rtl/>
-        </w:rPr>
-        <w:t xml:space="preserve">خارطة الكتاب: أربعة أبواب وأربعة عشر فصلًا</w:t>
-      </w:r>
-    </w:p>
-    <w:p>
-      <w:pPr>
-        <w:bidi/>
-        <w:rPr>
-          <w:rFonts w:ascii="Sakkal Majalla" w:hAnsi="Sakkal Majalla" w:cs="Sakkal Majalla"/>
-        </w:rPr>
-      </w:pPr>
-      <w:r>
-        <w:rPr>
-          <w:rFonts w:ascii="Sakkal Majalla" w:hAnsi="Sakkal Majalla" w:cs="Sakkal Majalla"/>
-          <w:color w:val="000000"/>
-          <w:sz w:val="30"/>
-          <w:szCs w:val="30"/>
-          <w:rtl/>
-        </w:rPr>
-        <w:t xml:space="preserve">لمن يُكتب هذا الكتاب؟</w:t>
-      </w:r>
-    </w:p>
-    <w:p>
-      <w:pPr>
-        <w:bidi/>
-        <w:rPr>
-          <w:rFonts w:ascii="Sakkal Majalla" w:hAnsi="Sakkal Majalla" w:cs="Sakkal Majalla"/>
-        </w:rPr>
-      </w:pPr>
-      <w:r>
-        <w:rPr>
-          <w:rFonts w:ascii="Sakkal Majalla" w:hAnsi="Sakkal Majalla" w:cs="Sakkal Majalla"/>
-          <w:color w:val="000000"/>
-          <w:sz w:val="30"/>
-          <w:szCs w:val="30"/>
-          <w:rtl/>
-        </w:rPr>
-        <w:t xml:space="preserve">بين يدي الكتاب: كلمة من المؤلف</w:t>
-      </w:r>
-    </w:p>
-    <w:p>
-      <w:pPr>
-        <w:bidi/>
-        <w:rPr>
-          <w:rFonts w:ascii="Sakkal Majalla" w:hAnsi="Sakkal Majalla" w:cs="Sakkal Majalla"/>
-        </w:rPr>
-      </w:pPr>
-      <w:r>
-        <w:rPr>
-          <w:rFonts w:ascii="Sakkal Majalla" w:hAnsi="Sakkal Majalla" w:cs="Sakkal Majalla"/>
-          <w:color w:val="000000"/>
-          <w:sz w:val="30"/>
-          <w:szCs w:val="30"/>
-          <w:rtl/>
-        </w:rPr>
-        <w:t xml:space="preserve">ملحق المقدمة: خريطة المفاهيم الأساسية</w:t>
-      </w:r>
-    </w:p>
-    <w:p>
-      <w:pPr>
-        <w:bidi/>
-        <w:rPr>
-          <w:rFonts w:ascii="Sakkal Majalla" w:hAnsi="Sakkal Majalla" w:cs="Sakkal Majalla"/>
-        </w:rPr>
-      </w:pPr>
-      <w:r>
-        <w:rPr>
-          <w:rFonts w:ascii="Sakkal Majalla" w:hAnsi="Sakkal Majalla" w:cs="Sakkal Majalla"/>
-          <w:b/>
-          <w:bCs/>
-          <w:color w:val="156082"/>
-          <w:sz w:val="30"/>
-          <w:szCs w:val="30"/>
-          <w:rtl/>
-        </w:rPr>
-        <w:t xml:space="preserve">الفصل الأول: ما هذا الكتاب؟ رؤيته وإطاره الابستيمولوجي وحدود ادعائه</w:t>
-      </w:r>
-    </w:p>
-    <w:p>
-      <w:pPr>
-        <w:bidi/>
-        <w:rPr>
-          <w:rFonts w:ascii="Sakkal Majalla" w:hAnsi="Sakkal Majalla" w:cs="Sakkal Majalla"/>
-        </w:rPr>
-      </w:pPr>
-      <w:r>
-        <w:rPr>
-          <w:rFonts w:ascii="Sakkal Majalla" w:hAnsi="Sakkal Majalla" w:cs="Sakkal Majalla"/>
-          <w:color w:val="000000"/>
-          <w:sz w:val="30"/>
-          <w:szCs w:val="30"/>
-          <w:rtl/>
-        </w:rPr>
-        <w:t xml:space="preserve">1.1  السؤال المؤسِّس: لماذا لا نسأل «أين الإدارة في القرآن؟»</w:t>
-      </w:r>
-    </w:p>
-    <w:p>
-      <w:pPr>
-        <w:bidi/>
-        <w:rPr>
-          <w:rFonts w:ascii="Sakkal Majalla" w:hAnsi="Sakkal Majalla" w:cs="Sakkal Majalla"/>
-        </w:rPr>
-      </w:pPr>
-      <w:r>
-        <w:rPr>
-          <w:rFonts w:ascii="Sakkal Majalla" w:hAnsi="Sakkal Majalla" w:cs="Sakkal Majalla"/>
-          <w:color w:val="000000"/>
-          <w:sz w:val="30"/>
-          <w:szCs w:val="30"/>
-          <w:rtl/>
-        </w:rPr>
-        <w:t xml:space="preserve">1.2  الإطار الابستيمولوجي الإسلامي: ما الذي نسلّم به وما الذي نختبره</w:t>
-      </w:r>
-    </w:p>
-    <w:p>
-      <w:pPr>
-        <w:bidi/>
-        <w:rPr>
-          <w:rFonts w:ascii="Sakkal Majalla" w:hAnsi="Sakkal Majalla" w:cs="Sakkal Majalla"/>
-        </w:rPr>
-      </w:pPr>
-      <w:r>
-        <w:rPr>
-          <w:rFonts w:ascii="Sakkal Majalla" w:hAnsi="Sakkal Majalla" w:cs="Sakkal Majalla"/>
-          <w:color w:val="000000"/>
-          <w:sz w:val="30"/>
-          <w:szCs w:val="30"/>
-          <w:rtl/>
-        </w:rPr>
-        <w:t xml:space="preserve">1.3  أقومية القرآن: المبدأ الذي يحكم الكتاب</w:t>
-      </w:r>
-    </w:p>
-    <w:p>
-      <w:pPr>
-        <w:bidi/>
-        <w:rPr>
-          <w:rFonts w:ascii="Sakkal Majalla" w:hAnsi="Sakkal Majalla" w:cs="Sakkal Majalla"/>
-        </w:rPr>
-      </w:pPr>
-      <w:r>
-        <w:rPr>
-          <w:rFonts w:ascii="Sakkal Majalla" w:hAnsi="Sakkal Majalla" w:cs="Sakkal Majalla"/>
-          <w:color w:val="000000"/>
-          <w:sz w:val="30"/>
-          <w:szCs w:val="30"/>
-          <w:rtl/>
-        </w:rPr>
-        <w:t xml:space="preserve">1.4  القرآن دستورًا، وهرم المصادر</w:t>
-      </w:r>
-    </w:p>
-    <w:p>
-      <w:pPr>
-        <w:bidi/>
-        <w:rPr>
-          <w:rFonts w:ascii="Sakkal Majalla" w:hAnsi="Sakkal Majalla" w:cs="Sakkal Majalla"/>
-        </w:rPr>
-      </w:pPr>
-      <w:r>
-        <w:rPr>
-          <w:rFonts w:ascii="Sakkal Majalla" w:hAnsi="Sakkal Majalla" w:cs="Sakkal Majalla"/>
-          <w:color w:val="000000"/>
-          <w:sz w:val="30"/>
-          <w:szCs w:val="30"/>
-          <w:rtl/>
-        </w:rPr>
-        <w:t xml:space="preserve">1.5  مشكلة القولبة: لماذا يكون الانطلاق من القرآن شرطًا</w:t>
-      </w:r>
-    </w:p>
-    <w:p>
-      <w:pPr>
-        <w:bidi/>
-        <w:rPr>
-          <w:rFonts w:ascii="Sakkal Majalla" w:hAnsi="Sakkal Majalla" w:cs="Sakkal Majalla"/>
-        </w:rPr>
-      </w:pPr>
-      <w:r>
-        <w:rPr>
-          <w:rFonts w:ascii="Sakkal Majalla" w:hAnsi="Sakkal Majalla" w:cs="Sakkal Majalla"/>
-          <w:color w:val="000000"/>
-          <w:sz w:val="30"/>
-          <w:szCs w:val="30"/>
-          <w:rtl/>
-        </w:rPr>
-        <w:t xml:space="preserve">1.6  اللحظة التاريخية: لماذا يبدو هذا المشروع ممكنًا الآن</w:t>
-      </w:r>
-    </w:p>
-    <w:p>
-      <w:pPr>
-        <w:bidi/>
-        <w:rPr>
-          <w:rFonts w:ascii="Sakkal Majalla" w:hAnsi="Sakkal Majalla" w:cs="Sakkal Majalla"/>
-        </w:rPr>
-      </w:pPr>
-      <w:r>
-        <w:rPr>
-          <w:rFonts w:ascii="Sakkal Majalla" w:hAnsi="Sakkal Majalla" w:cs="Sakkal Majalla"/>
-          <w:color w:val="000000"/>
-          <w:sz w:val="30"/>
-          <w:szCs w:val="30"/>
-          <w:rtl/>
-        </w:rPr>
-        <w:t xml:space="preserve">1.7  حدود الادعاء: ما يدّعيه هذا الفصل وما لا يدّعيه</w:t>
-      </w:r>
-    </w:p>
-    <w:p>
-      <w:pPr>
-        <w:bidi/>
-        <w:rPr>
-          <w:rFonts w:ascii="Sakkal Majalla" w:hAnsi="Sakkal Majalla" w:cs="Sakkal Majalla"/>
-        </w:rPr>
-      </w:pPr>
-      <w:r>
-        <w:rPr>
-          <w:rFonts w:ascii="Sakkal Majalla" w:hAnsi="Sakkal Majalla" w:cs="Sakkal Majalla"/>
-          <w:color w:val="000000"/>
-          <w:sz w:val="30"/>
-          <w:szCs w:val="30"/>
-          <w:rtl/>
-        </w:rPr>
-        <w:t xml:space="preserve">1.8  قائمة المراجع المذكورة في هذا الفصل</w:t>
-      </w:r>
-    </w:p>
-    <w:p>
-      <w:pPr>
-        <w:bidi/>
-        <w:rPr>
-          <w:rFonts w:ascii="Sakkal Majalla" w:hAnsi="Sakkal Majalla" w:cs="Sakkal Majalla"/>
-        </w:rPr>
-      </w:pPr>
-      <w:r>
-        <w:rPr>
-          <w:rFonts w:ascii="Sakkal Majalla" w:hAnsi="Sakkal Majalla" w:cs="Sakkal Majalla"/>
-          <w:b/>
-          <w:bCs/>
-          <w:color w:val="156082"/>
-          <w:sz w:val="30"/>
-          <w:szCs w:val="30"/>
-          <w:rtl/>
-        </w:rPr>
-        <w:t xml:space="preserve">الفصل الثاني: موقع المشروع في خريطة الفكر الإداري، وعِبرة الإخفاقات السابقة</w:t>
-      </w:r>
-    </w:p>
-    <w:p>
-      <w:pPr>
-        <w:bidi/>
-        <w:rPr>
-          <w:rFonts w:ascii="Sakkal Majalla" w:hAnsi="Sakkal Majalla" w:cs="Sakkal Majalla"/>
-        </w:rPr>
-      </w:pPr>
-      <w:r>
-        <w:rPr>
-          <w:rFonts w:ascii="Sakkal Majalla" w:hAnsi="Sakkal Majalla" w:cs="Sakkal Majalla"/>
-          <w:color w:val="000000"/>
-          <w:sz w:val="30"/>
-          <w:szCs w:val="30"/>
-          <w:rtl/>
-        </w:rPr>
-        <w:t xml:space="preserve">2.1  لماذا نبدأ بتحديد الموقع</w:t>
-      </w:r>
-    </w:p>
-    <w:p>
-      <w:pPr>
-        <w:bidi/>
-        <w:rPr>
-          <w:rFonts w:ascii="Sakkal Majalla" w:hAnsi="Sakkal Majalla" w:cs="Sakkal Majalla"/>
-        </w:rPr>
-      </w:pPr>
-      <w:r>
-        <w:rPr>
-          <w:rFonts w:ascii="Sakkal Majalla" w:hAnsi="Sakkal Majalla" w:cs="Sakkal Majalla"/>
-          <w:color w:val="000000"/>
-          <w:sz w:val="30"/>
-          <w:szCs w:val="30"/>
-          <w:rtl/>
-        </w:rPr>
-        <w:t xml:space="preserve">2.2  التيار الأول: الفكر الإداري الغربي الحديث</w:t>
-      </w:r>
-    </w:p>
-    <w:p>
-      <w:pPr>
-        <w:bidi/>
-        <w:rPr>
-          <w:rFonts w:ascii="Sakkal Majalla" w:hAnsi="Sakkal Majalla" w:cs="Sakkal Majalla"/>
-        </w:rPr>
-      </w:pPr>
-      <w:r>
-        <w:rPr>
-          <w:rFonts w:ascii="Sakkal Majalla" w:hAnsi="Sakkal Majalla" w:cs="Sakkal Majalla"/>
-          <w:color w:val="000000"/>
-          <w:sz w:val="30"/>
-          <w:szCs w:val="30"/>
-          <w:rtl/>
-        </w:rPr>
-        <w:t xml:space="preserve">2.3  التيار الثاني: التجربة الإدارية الإسلامية التاريخية</w:t>
-      </w:r>
-    </w:p>
-    <w:p>
-      <w:pPr>
-        <w:bidi/>
-        <w:rPr>
-          <w:rFonts w:ascii="Sakkal Majalla" w:hAnsi="Sakkal Majalla" w:cs="Sakkal Majalla"/>
-        </w:rPr>
-      </w:pPr>
-      <w:r>
-        <w:rPr>
-          <w:rFonts w:ascii="Sakkal Majalla" w:hAnsi="Sakkal Majalla" w:cs="Sakkal Majalla"/>
-          <w:color w:val="000000"/>
-          <w:sz w:val="30"/>
-          <w:szCs w:val="30"/>
-          <w:rtl/>
-        </w:rPr>
-        <w:t xml:space="preserve">2.4  التيار الثالث: الإدارة الإسلامية المعاصرة</w:t>
-      </w:r>
-    </w:p>
-    <w:p>
-      <w:pPr>
-        <w:bidi/>
-        <w:rPr>
-          <w:rFonts w:ascii="Sakkal Majalla" w:hAnsi="Sakkal Majalla" w:cs="Sakkal Majalla"/>
-        </w:rPr>
-      </w:pPr>
-      <w:r>
-        <w:rPr>
-          <w:rFonts w:ascii="Sakkal Majalla" w:hAnsi="Sakkal Majalla" w:cs="Sakkal Majalla"/>
-          <w:color w:val="000000"/>
-          <w:sz w:val="30"/>
-          <w:szCs w:val="30"/>
-          <w:rtl/>
-        </w:rPr>
-        <w:t xml:space="preserve">2.5  التيار الرابع: مشروع أسلمة المعرفة</w:t>
-      </w:r>
-    </w:p>
-    <w:p>
-      <w:pPr>
-        <w:bidi/>
-        <w:rPr>
-          <w:rFonts w:ascii="Sakkal Majalla" w:hAnsi="Sakkal Majalla" w:cs="Sakkal Majalla"/>
-        </w:rPr>
-      </w:pPr>
-      <w:r>
-        <w:rPr>
-          <w:rFonts w:ascii="Sakkal Majalla" w:hAnsi="Sakkal Majalla" w:cs="Sakkal Majalla"/>
-          <w:color w:val="000000"/>
-          <w:sz w:val="30"/>
-          <w:szCs w:val="30"/>
-          <w:rtl/>
-        </w:rPr>
-        <w:t xml:space="preserve">2.6  التيار الخامس: هذا المشروع والانطلاق من أقومية القرآن</w:t>
-      </w:r>
-    </w:p>
-    <w:p>
-      <w:pPr>
-        <w:bidi/>
-        <w:rPr>
-          <w:rFonts w:ascii="Sakkal Majalla" w:hAnsi="Sakkal Majalla" w:cs="Sakkal Majalla"/>
-        </w:rPr>
-      </w:pPr>
-      <w:r>
-        <w:rPr>
-          <w:rFonts w:ascii="Sakkal Majalla" w:hAnsi="Sakkal Majalla" w:cs="Sakkal Majalla"/>
-          <w:color w:val="000000"/>
-          <w:sz w:val="30"/>
-          <w:szCs w:val="30"/>
-          <w:rtl/>
-        </w:rPr>
-        <w:t xml:space="preserve">2.7  لماذا لم تحلّ أسلمة المعرفة الإشكالية الإدارية: سبعة أسباب بنيوية</w:t>
-      </w:r>
-    </w:p>
-    <w:p>
-      <w:pPr>
-        <w:bidi/>
-        <w:rPr>
-          <w:rFonts w:ascii="Sakkal Majalla" w:hAnsi="Sakkal Majalla" w:cs="Sakkal Majalla"/>
-        </w:rPr>
-      </w:pPr>
-      <w:r>
-        <w:rPr>
-          <w:rFonts w:ascii="Sakkal Majalla" w:hAnsi="Sakkal Majalla" w:cs="Sakkal Majalla"/>
-          <w:color w:val="000000"/>
-          <w:sz w:val="30"/>
-          <w:szCs w:val="30"/>
-          <w:rtl/>
-        </w:rPr>
-        <w:t xml:space="preserve">2.8  القولبة: تشخيص أعمق للسبب الجذري</w:t>
-      </w:r>
-    </w:p>
-    <w:p>
-      <w:pPr>
-        <w:bidi/>
-        <w:rPr>
-          <w:rFonts w:ascii="Sakkal Majalla" w:hAnsi="Sakkal Majalla" w:cs="Sakkal Majalla"/>
-        </w:rPr>
-      </w:pPr>
-      <w:r>
-        <w:rPr>
-          <w:rFonts w:ascii="Sakkal Majalla" w:hAnsi="Sakkal Majalla" w:cs="Sakkal Majalla"/>
-          <w:color w:val="000000"/>
-          <w:sz w:val="30"/>
-          <w:szCs w:val="30"/>
-          <w:rtl/>
-        </w:rPr>
-        <w:t xml:space="preserve">2.9  النقد الداخلي للإدارة الغربية: لماذا الفراغ حقيقي</w:t>
-      </w:r>
-    </w:p>
-    <w:p>
-      <w:pPr>
-        <w:bidi/>
-        <w:rPr>
-          <w:rFonts w:ascii="Sakkal Majalla" w:hAnsi="Sakkal Majalla" w:cs="Sakkal Majalla"/>
-        </w:rPr>
-      </w:pPr>
-      <w:r>
-        <w:rPr>
-          <w:rFonts w:ascii="Sakkal Majalla" w:hAnsi="Sakkal Majalla" w:cs="Sakkal Majalla"/>
-          <w:color w:val="000000"/>
-          <w:sz w:val="30"/>
-          <w:szCs w:val="30"/>
-          <w:rtl/>
-        </w:rPr>
-        <w:t xml:space="preserve">2.10  خمسة أسئلة جوهرية: كيف يجيب عنها كل تيار</w:t>
-      </w:r>
-    </w:p>
-    <w:p>
-      <w:pPr>
-        <w:bidi/>
-        <w:rPr>
-          <w:rFonts w:ascii="Sakkal Majalla" w:hAnsi="Sakkal Majalla" w:cs="Sakkal Majalla"/>
-        </w:rPr>
-      </w:pPr>
-      <w:r>
-        <w:rPr>
-          <w:rFonts w:ascii="Sakkal Majalla" w:hAnsi="Sakkal Majalla" w:cs="Sakkal Majalla"/>
-          <w:color w:val="000000"/>
-          <w:sz w:val="30"/>
-          <w:szCs w:val="30"/>
-          <w:rtl/>
-        </w:rPr>
-        <w:t xml:space="preserve">2.11  دراسة حالة: التمويل الإسلامي والقولبة في أوضح صورها</w:t>
-      </w:r>
-    </w:p>
-    <w:p>
-      <w:pPr>
-        <w:bidi/>
-        <w:rPr>
-          <w:rFonts w:ascii="Sakkal Majalla" w:hAnsi="Sakkal Majalla" w:cs="Sakkal Majalla"/>
-        </w:rPr>
-      </w:pPr>
-      <w:r>
-        <w:rPr>
-          <w:rFonts w:ascii="Sakkal Majalla" w:hAnsi="Sakkal Majalla" w:cs="Sakkal Majalla"/>
-          <w:color w:val="000000"/>
-          <w:sz w:val="30"/>
-          <w:szCs w:val="30"/>
-          <w:rtl/>
-        </w:rPr>
-        <w:t xml:space="preserve">2.12  حدود الادعاء: ما يثبته هذا الفصل وما لا يثبته</w:t>
-      </w:r>
-    </w:p>
-    <w:p>
-      <w:pPr>
-        <w:bidi/>
-        <w:rPr>
-          <w:rFonts w:ascii="Sakkal Majalla" w:hAnsi="Sakkal Majalla" w:cs="Sakkal Majalla"/>
-        </w:rPr>
-      </w:pPr>
-      <w:r>
-        <w:rPr>
-          <w:rFonts w:ascii="Sakkal Majalla" w:hAnsi="Sakkal Majalla" w:cs="Sakkal Majalla"/>
-          <w:color w:val="000000"/>
-          <w:sz w:val="30"/>
-          <w:szCs w:val="30"/>
-          <w:rtl/>
-        </w:rPr>
-        <w:t xml:space="preserve">2.13  قائمة المراجع المذكورة في هذا الفصل</w:t>
-      </w:r>
-    </w:p>
-    <w:p>
-      <w:pPr>
-        <w:bidi/>
-        <w:rPr>
-          <w:rFonts w:ascii="Sakkal Majalla" w:hAnsi="Sakkal Majalla" w:cs="Sakkal Majalla"/>
-        </w:rPr>
-      </w:pPr>
-      <w:r>
-        <w:rPr>
-          <w:rFonts w:ascii="Sakkal Majalla" w:hAnsi="Sakkal Majalla" w:cs="Sakkal Majalla"/>
-          <w:b/>
-          <w:bCs/>
-          <w:color w:val="156082"/>
-          <w:sz w:val="30"/>
-          <w:szCs w:val="30"/>
-          <w:rtl/>
-        </w:rPr>
-        <w:t xml:space="preserve">الفصل الثالث: الفرضية الصفرية، الضمانة العلمية للمشروع ومحكّات الاختبار</w:t>
-      </w:r>
-    </w:p>
-    <w:p>
-      <w:pPr>
-        <w:bidi/>
-        <w:rPr>
-          <w:rFonts w:ascii="Sakkal Majalla" w:hAnsi="Sakkal Majalla" w:cs="Sakkal Majalla"/>
-        </w:rPr>
-      </w:pPr>
-      <w:r>
-        <w:rPr>
-          <w:rFonts w:ascii="Sakkal Majalla" w:hAnsi="Sakkal Majalla" w:cs="Sakkal Majalla"/>
-          <w:color w:val="000000"/>
-          <w:sz w:val="30"/>
-          <w:szCs w:val="30"/>
-          <w:rtl/>
-        </w:rPr>
-        <w:t xml:space="preserve">3.1  مشكلة الفصل بين العلم واللاعلم، ولماذا تخصّ هذا المشروع</w:t>
-      </w:r>
-    </w:p>
-    <w:p>
-      <w:pPr>
-        <w:bidi/>
-        <w:rPr>
-          <w:rFonts w:ascii="Sakkal Majalla" w:hAnsi="Sakkal Majalla" w:cs="Sakkal Majalla"/>
-        </w:rPr>
-      </w:pPr>
-      <w:r>
-        <w:rPr>
-          <w:rFonts w:ascii="Sakkal Majalla" w:hAnsi="Sakkal Majalla" w:cs="Sakkal Majalla"/>
-          <w:color w:val="000000"/>
-          <w:sz w:val="30"/>
-          <w:szCs w:val="30"/>
-          <w:rtl/>
-        </w:rPr>
-        <w:t xml:space="preserve">3.2  لماذا لا نكتفي بإطار لاكاتوش؟</w:t>
-      </w:r>
-    </w:p>
-    <w:p>
-      <w:pPr>
-        <w:bidi/>
-        <w:rPr>
-          <w:rFonts w:ascii="Sakkal Majalla" w:hAnsi="Sakkal Majalla" w:cs="Sakkal Majalla"/>
-        </w:rPr>
-      </w:pPr>
-      <w:r>
-        <w:rPr>
-          <w:rFonts w:ascii="Sakkal Majalla" w:hAnsi="Sakkal Majalla" w:cs="Sakkal Majalla"/>
-          <w:color w:val="000000"/>
-          <w:sz w:val="30"/>
-          <w:szCs w:val="30"/>
-          <w:rtl/>
-        </w:rPr>
-        <w:t xml:space="preserve">3.3  قائمة النفي الثمانية: حدود منهجية لا نتجاوزها</w:t>
-      </w:r>
-    </w:p>
-    <w:p>
-      <w:pPr>
-        <w:bidi/>
-        <w:rPr>
-          <w:rFonts w:ascii="Sakkal Majalla" w:hAnsi="Sakkal Majalla" w:cs="Sakkal Majalla"/>
-        </w:rPr>
-      </w:pPr>
-      <w:r>
-        <w:rPr>
-          <w:rFonts w:ascii="Sakkal Majalla" w:hAnsi="Sakkal Majalla" w:cs="Sakkal Majalla"/>
-          <w:color w:val="000000"/>
-          <w:sz w:val="30"/>
-          <w:szCs w:val="30"/>
-          <w:rtl/>
-        </w:rPr>
-        <w:t xml:space="preserve">3.4  الفرضية الصفرية: الصياغة الرسمية وتحليلها</w:t>
-      </w:r>
-    </w:p>
-    <w:p>
-      <w:pPr>
-        <w:bidi/>
-        <w:rPr>
-          <w:rFonts w:ascii="Sakkal Majalla" w:hAnsi="Sakkal Majalla" w:cs="Sakkal Majalla"/>
-        </w:rPr>
-      </w:pPr>
-      <w:r>
-        <w:rPr>
-          <w:rFonts w:ascii="Sakkal Majalla" w:hAnsi="Sakkal Majalla" w:cs="Sakkal Majalla"/>
-          <w:color w:val="000000"/>
-          <w:sz w:val="30"/>
-          <w:szCs w:val="30"/>
-          <w:rtl/>
-        </w:rPr>
-        <w:t xml:space="preserve">3.5  المحك الأول: الأصالة</w:t>
-      </w:r>
-    </w:p>
-    <w:p>
-      <w:pPr>
-        <w:bidi/>
-        <w:rPr>
-          <w:rFonts w:ascii="Sakkal Majalla" w:hAnsi="Sakkal Majalla" w:cs="Sakkal Majalla"/>
-        </w:rPr>
-      </w:pPr>
-      <w:r>
-        <w:rPr>
-          <w:rFonts w:ascii="Sakkal Majalla" w:hAnsi="Sakkal Majalla" w:cs="Sakkal Majalla"/>
-          <w:color w:val="000000"/>
-          <w:sz w:val="30"/>
-          <w:szCs w:val="30"/>
-          <w:rtl/>
-        </w:rPr>
-        <w:t xml:space="preserve">3.6  المحك الثاني: الاستقلالية</w:t>
-      </w:r>
-    </w:p>
-    <w:p>
-      <w:pPr>
-        <w:bidi/>
-        <w:rPr>
-          <w:rFonts w:ascii="Sakkal Majalla" w:hAnsi="Sakkal Majalla" w:cs="Sakkal Majalla"/>
-        </w:rPr>
-      </w:pPr>
-      <w:r>
-        <w:rPr>
-          <w:rFonts w:ascii="Sakkal Majalla" w:hAnsi="Sakkal Majalla" w:cs="Sakkal Majalla"/>
-          <w:color w:val="000000"/>
-          <w:sz w:val="30"/>
-          <w:szCs w:val="30"/>
-          <w:rtl/>
-        </w:rPr>
-        <w:t xml:space="preserve">3.7  المحك الثالث: التمييز</w:t>
-      </w:r>
-    </w:p>
-    <w:p>
-      <w:pPr>
-        <w:bidi/>
-        <w:rPr>
-          <w:rFonts w:ascii="Sakkal Majalla" w:hAnsi="Sakkal Majalla" w:cs="Sakkal Majalla"/>
-        </w:rPr>
-      </w:pPr>
-      <w:r>
-        <w:rPr>
-          <w:rFonts w:ascii="Sakkal Majalla" w:hAnsi="Sakkal Majalla" w:cs="Sakkal Majalla"/>
-          <w:color w:val="000000"/>
-          <w:sz w:val="30"/>
-          <w:szCs w:val="30"/>
-          <w:rtl/>
-        </w:rPr>
-        <w:t xml:space="preserve">3.8  أربعة تطبيقات للمحكّات الثلاثة، مع الاعتراضات والردود</w:t>
-      </w:r>
-    </w:p>
-    <w:p>
-      <w:pPr>
-        <w:bidi/>
-        <w:rPr>
-          <w:rFonts w:ascii="Sakkal Majalla" w:hAnsi="Sakkal Majalla" w:cs="Sakkal Majalla"/>
-        </w:rPr>
-      </w:pPr>
-      <w:r>
-        <w:rPr>
-          <w:rFonts w:ascii="Sakkal Majalla" w:hAnsi="Sakkal Majalla" w:cs="Sakkal Majalla"/>
-          <w:color w:val="000000"/>
-          <w:sz w:val="30"/>
-          <w:szCs w:val="30"/>
-          <w:rtl/>
-        </w:rPr>
-        <w:t xml:space="preserve">3.9  بروتوكول الاختبار التجريبي: من التصميم إلى النشر</w:t>
-      </w:r>
-    </w:p>
-    <w:p>
-      <w:pPr>
-        <w:bidi/>
-        <w:rPr>
-          <w:rFonts w:ascii="Sakkal Majalla" w:hAnsi="Sakkal Majalla" w:cs="Sakkal Majalla"/>
-        </w:rPr>
-      </w:pPr>
-      <w:r>
-        <w:rPr>
-          <w:rFonts w:ascii="Sakkal Majalla" w:hAnsi="Sakkal Majalla" w:cs="Sakkal Majalla"/>
-          <w:color w:val="000000"/>
-          <w:sz w:val="30"/>
-          <w:szCs w:val="30"/>
-          <w:rtl/>
-        </w:rPr>
-        <w:t xml:space="preserve">3.10  جدول القبول والرفض، ودراسة حالة للفشل الكامل</w:t>
-      </w:r>
-    </w:p>
-    <w:p>
-      <w:pPr>
-        <w:bidi/>
-        <w:rPr>
-          <w:rFonts w:ascii="Sakkal Majalla" w:hAnsi="Sakkal Majalla" w:cs="Sakkal Majalla"/>
-        </w:rPr>
-      </w:pPr>
-      <w:r>
-        <w:rPr>
-          <w:rFonts w:ascii="Sakkal Majalla" w:hAnsi="Sakkal Majalla" w:cs="Sakkal Majalla"/>
-          <w:color w:val="000000"/>
-          <w:sz w:val="30"/>
-          <w:szCs w:val="30"/>
-          <w:rtl/>
-        </w:rPr>
-        <w:t xml:space="preserve">3.11  آلية فض التعارض بين النص والتجربة: مراتب المرجعية وقابلية التعديل</w:t>
-      </w:r>
-    </w:p>
-    <w:p>
-      <w:pPr>
-        <w:bidi/>
-        <w:rPr>
-          <w:rFonts w:ascii="Sakkal Majalla" w:hAnsi="Sakkal Majalla" w:cs="Sakkal Majalla"/>
-        </w:rPr>
-      </w:pPr>
-      <w:r>
-        <w:rPr>
-          <w:rFonts w:ascii="Sakkal Majalla" w:hAnsi="Sakkal Majalla" w:cs="Sakkal Majalla"/>
-          <w:color w:val="000000"/>
-          <w:sz w:val="30"/>
-          <w:szCs w:val="30"/>
-          <w:rtl/>
-        </w:rPr>
-        <w:t xml:space="preserve">3.12  ثلاثة اعتراضات جذرية على المنهجية كلها</w:t>
-      </w:r>
-    </w:p>
-    <w:p>
-      <w:pPr>
-        <w:bidi/>
-        <w:rPr>
-          <w:rFonts w:ascii="Sakkal Majalla" w:hAnsi="Sakkal Majalla" w:cs="Sakkal Majalla"/>
-        </w:rPr>
-      </w:pPr>
-      <w:r>
-        <w:rPr>
-          <w:rFonts w:ascii="Sakkal Majalla" w:hAnsi="Sakkal Majalla" w:cs="Sakkal Majalla"/>
-          <w:color w:val="000000"/>
-          <w:sz w:val="30"/>
-          <w:szCs w:val="30"/>
-          <w:rtl/>
-        </w:rPr>
-        <w:t xml:space="preserve">3.13  حدود الادعاء: ما يثبته هذا الفصل وما لا يثبته</w:t>
-      </w:r>
-    </w:p>
-    <w:p>
-      <w:pPr>
-        <w:bidi/>
-        <w:rPr>
-          <w:rFonts w:ascii="Sakkal Majalla" w:hAnsi="Sakkal Majalla" w:cs="Sakkal Majalla"/>
-        </w:rPr>
-      </w:pPr>
-      <w:r>
-        <w:rPr>
-          <w:rFonts w:ascii="Sakkal Majalla" w:hAnsi="Sakkal Majalla" w:cs="Sakkal Majalla"/>
-          <w:color w:val="000000"/>
-          <w:sz w:val="30"/>
-          <w:szCs w:val="30"/>
-          <w:rtl/>
-        </w:rPr>
-        <w:t xml:space="preserve">3.14  قائمة المراجع المذكورة في هذا الفصل</w:t>
-      </w:r>
-    </w:p>
-    <w:p>
-      <w:pPr>
-        <w:bidi/>
-        <w:rPr>
-          <w:rFonts w:ascii="Sakkal Majalla" w:hAnsi="Sakkal Majalla" w:cs="Sakkal Majalla"/>
-        </w:rPr>
-      </w:pPr>
-      <w:r>
-        <w:rPr>
-          <w:rFonts w:ascii="Sakkal Majalla" w:hAnsi="Sakkal Majalla" w:cs="Sakkal Majalla"/>
-          <w:b/>
-          <w:bCs/>
-          <w:color w:val="156082"/>
-          <w:sz w:val="30"/>
-          <w:szCs w:val="30"/>
-          <w:rtl/>
-        </w:rPr>
-        <w:t xml:space="preserve">الفصل الرابع: القرآن دستورًا والمصادر الشارحة، هرم المرجعية الكامل</w:t>
-      </w:r>
-    </w:p>
-    <w:p>
-      <w:pPr>
-        <w:bidi/>
-        <w:rPr>
-          <w:rFonts w:ascii="Sakkal Majalla" w:hAnsi="Sakkal Majalla" w:cs="Sakkal Majalla"/>
-        </w:rPr>
-      </w:pPr>
-      <w:r>
-        <w:rPr>
-          <w:rFonts w:ascii="Sakkal Majalla" w:hAnsi="Sakkal Majalla" w:cs="Sakkal Majalla"/>
-          <w:color w:val="000000"/>
-          <w:sz w:val="30"/>
-          <w:szCs w:val="30"/>
-          <w:rtl/>
-        </w:rPr>
-        <w:t xml:space="preserve">4.1  لماذا يكون ترتيب المصادر مسألة فلسفية قبل أن يكون تنظيمية</w:t>
-      </w:r>
-    </w:p>
-    <w:p>
-      <w:pPr>
-        <w:bidi/>
-        <w:rPr>
-          <w:rFonts w:ascii="Sakkal Majalla" w:hAnsi="Sakkal Majalla" w:cs="Sakkal Majalla"/>
-        </w:rPr>
-      </w:pPr>
-      <w:r>
-        <w:rPr>
-          <w:rFonts w:ascii="Sakkal Majalla" w:hAnsi="Sakkal Majalla" w:cs="Sakkal Majalla"/>
-          <w:color w:val="000000"/>
-          <w:sz w:val="30"/>
-          <w:szCs w:val="30"/>
-          <w:rtl/>
-        </w:rPr>
-        <w:t xml:space="preserve">4.2  السنة بيانًا لا منشأً: التأصيل من علم أصول الفقه</w:t>
-      </w:r>
-    </w:p>
-    <w:p>
-      <w:pPr>
-        <w:bidi/>
-        <w:rPr>
-          <w:rFonts w:ascii="Sakkal Majalla" w:hAnsi="Sakkal Majalla" w:cs="Sakkal Majalla"/>
-        </w:rPr>
-      </w:pPr>
-      <w:r>
-        <w:rPr>
-          <w:rFonts w:ascii="Sakkal Majalla" w:hAnsi="Sakkal Majalla" w:cs="Sakkal Majalla"/>
-          <w:color w:val="000000"/>
-          <w:sz w:val="30"/>
-          <w:szCs w:val="30"/>
-          <w:rtl/>
-        </w:rPr>
-        <w:t xml:space="preserve">4.3  خمس مدارس تفسيرية: معايير الاختيار والتحليل النقدي</w:t>
-      </w:r>
-    </w:p>
-    <w:p>
-      <w:pPr>
-        <w:bidi/>
-        <w:rPr>
-          <w:rFonts w:ascii="Sakkal Majalla" w:hAnsi="Sakkal Majalla" w:cs="Sakkal Majalla"/>
-        </w:rPr>
-      </w:pPr>
-      <w:r>
-        <w:rPr>
-          <w:rFonts w:ascii="Sakkal Majalla" w:hAnsi="Sakkal Majalla" w:cs="Sakkal Majalla"/>
-          <w:color w:val="000000"/>
-          <w:sz w:val="30"/>
-          <w:szCs w:val="30"/>
-          <w:rtl/>
-        </w:rPr>
-        <w:t xml:space="preserve">4.4  مسألة الطباطبائي: ضوابط الاستفادة من مصدر خارج المدرسة السنية</w:t>
-      </w:r>
-    </w:p>
-    <w:p>
-      <w:pPr>
-        <w:bidi/>
-        <w:rPr>
-          <w:rFonts w:ascii="Sakkal Majalla" w:hAnsi="Sakkal Majalla" w:cs="Sakkal Majalla"/>
-        </w:rPr>
-      </w:pPr>
-      <w:r>
-        <w:rPr>
-          <w:rFonts w:ascii="Sakkal Majalla" w:hAnsi="Sakkal Majalla" w:cs="Sakkal Majalla"/>
-          <w:color w:val="000000"/>
-          <w:sz w:val="30"/>
-          <w:szCs w:val="30"/>
-          <w:rtl/>
-        </w:rPr>
-        <w:t xml:space="preserve">4.5  تراتبية مصادر السيرة: الثبوت التاريخي قبل الشهرة الأدبية</w:t>
-      </w:r>
-    </w:p>
-    <w:p>
-      <w:pPr>
-        <w:bidi/>
-        <w:rPr>
-          <w:rFonts w:ascii="Sakkal Majalla" w:hAnsi="Sakkal Majalla" w:cs="Sakkal Majalla"/>
-        </w:rPr>
-      </w:pPr>
-      <w:r>
-        <w:rPr>
-          <w:rFonts w:ascii="Sakkal Majalla" w:hAnsi="Sakkal Majalla" w:cs="Sakkal Majalla"/>
-          <w:color w:val="000000"/>
-          <w:sz w:val="30"/>
-          <w:szCs w:val="30"/>
-          <w:rtl/>
-        </w:rPr>
-        <w:t xml:space="preserve">4.6  المصادر اللغوية: من الجذر إلى البلاغة</w:t>
-      </w:r>
-    </w:p>
-    <w:p>
-      <w:pPr>
-        <w:bidi/>
-        <w:rPr>
-          <w:rFonts w:ascii="Sakkal Majalla" w:hAnsi="Sakkal Majalla" w:cs="Sakkal Majalla"/>
-        </w:rPr>
-      </w:pPr>
-      <w:r>
-        <w:rPr>
-          <w:rFonts w:ascii="Sakkal Majalla" w:hAnsi="Sakkal Majalla" w:cs="Sakkal Majalla"/>
-          <w:color w:val="000000"/>
-          <w:sz w:val="30"/>
-          <w:szCs w:val="30"/>
-          <w:rtl/>
-        </w:rPr>
-        <w:t xml:space="preserve">4.7  تطبيق كامل لهرم المصادر: مفهوم «العدل» من الدلالة إلى المبدأ</w:t>
-      </w:r>
-    </w:p>
-    <w:p>
-      <w:pPr>
-        <w:bidi/>
-        <w:rPr>
-          <w:rFonts w:ascii="Sakkal Majalla" w:hAnsi="Sakkal Majalla" w:cs="Sakkal Majalla"/>
-        </w:rPr>
-      </w:pPr>
-      <w:r>
-        <w:rPr>
-          <w:rFonts w:ascii="Sakkal Majalla" w:hAnsi="Sakkal Majalla" w:cs="Sakkal Majalla"/>
-          <w:color w:val="000000"/>
-          <w:sz w:val="30"/>
-          <w:szCs w:val="30"/>
-          <w:rtl/>
-        </w:rPr>
-        <w:t xml:space="preserve">4.8  مقارنة فلسفية: نظرية السلطة المعرفية ونظريات الشهادة الغربية</w:t>
-      </w:r>
-    </w:p>
-    <w:p>
-      <w:pPr>
-        <w:bidi/>
-        <w:rPr>
-          <w:rFonts w:ascii="Sakkal Majalla" w:hAnsi="Sakkal Majalla" w:cs="Sakkal Majalla"/>
-        </w:rPr>
-      </w:pPr>
-      <w:r>
-        <w:rPr>
-          <w:rFonts w:ascii="Sakkal Majalla" w:hAnsi="Sakkal Majalla" w:cs="Sakkal Majalla"/>
-          <w:color w:val="000000"/>
-          <w:sz w:val="30"/>
-          <w:szCs w:val="30"/>
-          <w:rtl/>
-        </w:rPr>
-        <w:t xml:space="preserve">4.9  أربعة اعتراضات على هرم المصادر</w:t>
-      </w:r>
-    </w:p>
-    <w:p>
-      <w:pPr>
-        <w:bidi/>
-        <w:rPr>
-          <w:rFonts w:ascii="Sakkal Majalla" w:hAnsi="Sakkal Majalla" w:cs="Sakkal Majalla"/>
-        </w:rPr>
-      </w:pPr>
-      <w:r>
-        <w:rPr>
-          <w:rFonts w:ascii="Sakkal Majalla" w:hAnsi="Sakkal Majalla" w:cs="Sakkal Majalla"/>
-          <w:color w:val="000000"/>
-          <w:sz w:val="30"/>
-          <w:szCs w:val="30"/>
-          <w:rtl/>
-        </w:rPr>
-        <w:t xml:space="preserve">4.10  حدود الادعاء: ما يثبته هذا الفصل وما لا يثبته</w:t>
-      </w:r>
-    </w:p>
-    <w:p>
-      <w:pPr>
-        <w:bidi/>
-        <w:rPr>
-          <w:rFonts w:ascii="Sakkal Majalla" w:hAnsi="Sakkal Majalla" w:cs="Sakkal Majalla"/>
-        </w:rPr>
-      </w:pPr>
-      <w:r>
-        <w:rPr>
-          <w:rFonts w:ascii="Sakkal Majalla" w:hAnsi="Sakkal Majalla" w:cs="Sakkal Majalla"/>
-          <w:color w:val="000000"/>
-          <w:sz w:val="30"/>
-          <w:szCs w:val="30"/>
-          <w:rtl/>
-        </w:rPr>
-        <w:t xml:space="preserve">4.11  قائمة المراجع المذكورة في هذا الفصل</w:t>
-      </w:r>
-    </w:p>
-    <w:p>
-      <w:pPr>
-        <w:bidi/>
-        <w:rPr>
-          <w:rFonts w:ascii="Sakkal Majalla" w:hAnsi="Sakkal Majalla" w:cs="Sakkal Majalla"/>
-        </w:rPr>
-      </w:pPr>
-      <w:r>
-        <w:rPr>
-          <w:rFonts w:ascii="Sakkal Majalla" w:hAnsi="Sakkal Majalla" w:cs="Sakkal Majalla"/>
-          <w:b/>
-          <w:bCs/>
-          <w:color w:val="156082"/>
-          <w:sz w:val="30"/>
-          <w:szCs w:val="30"/>
-          <w:rtl/>
-        </w:rPr>
-        <w:t xml:space="preserve">الفصل الخامس: سلم الاشتقاق السباعي وبطاقة الهوية المعرفية، من الآية إلى المبدأ الإداري: سبعة مستويات مع بوابة الضمان المنهجي</w:t>
-      </w:r>
-    </w:p>
-    <w:p>
-      <w:pPr>
-        <w:bidi/>
-        <w:rPr>
-          <w:rFonts w:ascii="Sakkal Majalla" w:hAnsi="Sakkal Majalla" w:cs="Sakkal Majalla"/>
-        </w:rPr>
-      </w:pPr>
-      <w:r>
-        <w:rPr>
-          <w:rFonts w:ascii="Sakkal Majalla" w:hAnsi="Sakkal Majalla" w:cs="Sakkal Majalla"/>
-          <w:color w:val="000000"/>
-          <w:sz w:val="30"/>
-          <w:szCs w:val="30"/>
-          <w:rtl/>
-        </w:rPr>
-        <w:t xml:space="preserve">5.1  لماذا نحتاج إلى سلم متدرّج: مشكلة الفجوة بين الوصف والمعيار</w:t>
-      </w:r>
-    </w:p>
-    <w:p>
-      <w:pPr>
-        <w:bidi/>
-        <w:rPr>
-          <w:rFonts w:ascii="Sakkal Majalla" w:hAnsi="Sakkal Majalla" w:cs="Sakkal Majalla"/>
-        </w:rPr>
-      </w:pPr>
-      <w:r>
-        <w:rPr>
-          <w:rFonts w:ascii="Sakkal Majalla" w:hAnsi="Sakkal Majalla" w:cs="Sakkal Majalla"/>
-          <w:color w:val="000000"/>
-          <w:sz w:val="30"/>
-          <w:szCs w:val="30"/>
-          <w:rtl/>
-        </w:rPr>
-        <w:t xml:space="preserve">5.2  المستويات السبعة: تعريف إجرائي لكل مستوى</w:t>
-      </w:r>
-    </w:p>
-    <w:p>
-      <w:pPr>
-        <w:bidi/>
-        <w:rPr>
-          <w:rFonts w:ascii="Sakkal Majalla" w:hAnsi="Sakkal Majalla" w:cs="Sakkal Majalla"/>
-        </w:rPr>
-      </w:pPr>
-      <w:r>
-        <w:rPr>
-          <w:rFonts w:ascii="Sakkal Majalla" w:hAnsi="Sakkal Majalla" w:cs="Sakkal Majalla"/>
-          <w:color w:val="000000"/>
-          <w:sz w:val="30"/>
-          <w:szCs w:val="30"/>
-          <w:rtl/>
-        </w:rPr>
-        <w:t xml:space="preserve">5.3  التأصيل الأصولي: سلم الاشتقاق امتداد لمنهج الاستنباط</w:t>
-      </w:r>
-    </w:p>
-    <w:p>
-      <w:pPr>
-        <w:bidi/>
-        <w:rPr>
-          <w:rFonts w:ascii="Sakkal Majalla" w:hAnsi="Sakkal Majalla" w:cs="Sakkal Majalla"/>
-        </w:rPr>
-      </w:pPr>
-      <w:r>
-        <w:rPr>
-          <w:rFonts w:ascii="Sakkal Majalla" w:hAnsi="Sakkal Majalla" w:cs="Sakkal Majalla"/>
-          <w:color w:val="000000"/>
-          <w:sz w:val="30"/>
-          <w:szCs w:val="30"/>
-          <w:rtl/>
-        </w:rPr>
-        <w:t xml:space="preserve">5.4  ضابط المقاصد: البوابة الإلزامية بين المستويين الرابع والخامس</w:t>
-      </w:r>
-    </w:p>
-    <w:p>
-      <w:pPr>
-        <w:bidi/>
-        <w:rPr>
-          <w:rFonts w:ascii="Sakkal Majalla" w:hAnsi="Sakkal Majalla" w:cs="Sakkal Majalla"/>
-        </w:rPr>
-      </w:pPr>
-      <w:r>
-        <w:rPr>
-          <w:rFonts w:ascii="Sakkal Majalla" w:hAnsi="Sakkal Majalla" w:cs="Sakkal Majalla"/>
-          <w:color w:val="000000"/>
-          <w:sz w:val="30"/>
-          <w:szCs w:val="30"/>
-          <w:rtl/>
-        </w:rPr>
-        <w:t xml:space="preserve">5.5  معايير الترقية الستة ومعايير الرفض الخمسة</w:t>
-      </w:r>
-    </w:p>
-    <w:p>
-      <w:pPr>
-        <w:bidi/>
-        <w:rPr>
-          <w:rFonts w:ascii="Sakkal Majalla" w:hAnsi="Sakkal Majalla" w:cs="Sakkal Majalla"/>
-        </w:rPr>
-      </w:pPr>
-      <w:r>
-        <w:rPr>
-          <w:rFonts w:ascii="Sakkal Majalla" w:hAnsi="Sakkal Majalla" w:cs="Sakkal Majalla"/>
-          <w:color w:val="000000"/>
-          <w:sz w:val="30"/>
-          <w:szCs w:val="30"/>
-          <w:rtl/>
-        </w:rPr>
-        <w:t xml:space="preserve">5.6  تطبيق كامل: مفهوم الشورى عبر المستويات السبعة</w:t>
-      </w:r>
-    </w:p>
-    <w:p>
-      <w:pPr>
-        <w:bidi/>
-        <w:rPr>
-          <w:rFonts w:ascii="Sakkal Majalla" w:hAnsi="Sakkal Majalla" w:cs="Sakkal Majalla"/>
-        </w:rPr>
-      </w:pPr>
-      <w:r>
-        <w:rPr>
-          <w:rFonts w:ascii="Sakkal Majalla" w:hAnsi="Sakkal Majalla" w:cs="Sakkal Majalla"/>
-          <w:color w:val="000000"/>
-          <w:sz w:val="30"/>
-          <w:szCs w:val="30"/>
-          <w:rtl/>
-        </w:rPr>
-        <w:t xml:space="preserve">5.7  مقارنة منهجية: سلم الاشتقاق ومنهجيات بناء النظرية الغربية</w:t>
-      </w:r>
-    </w:p>
-    <w:p>
-      <w:pPr>
-        <w:bidi/>
-        <w:rPr>
-          <w:rFonts w:ascii="Sakkal Majalla" w:hAnsi="Sakkal Majalla" w:cs="Sakkal Majalla"/>
-        </w:rPr>
-      </w:pPr>
-      <w:r>
-        <w:rPr>
-          <w:rFonts w:ascii="Sakkal Majalla" w:hAnsi="Sakkal Majalla" w:cs="Sakkal Majalla"/>
-          <w:color w:val="000000"/>
-          <w:sz w:val="30"/>
-          <w:szCs w:val="30"/>
-          <w:rtl/>
-        </w:rPr>
-        <w:t xml:space="preserve">5.8  أربعة اعتراضات على سلم الاشتقاق</w:t>
-      </w:r>
-    </w:p>
-    <w:p>
-      <w:pPr>
-        <w:bidi/>
-        <w:rPr>
-          <w:rFonts w:ascii="Sakkal Majalla" w:hAnsi="Sakkal Majalla" w:cs="Sakkal Majalla"/>
-        </w:rPr>
-      </w:pPr>
-      <w:r>
-        <w:rPr>
-          <w:rFonts w:ascii="Sakkal Majalla" w:hAnsi="Sakkal Majalla" w:cs="Sakkal Majalla"/>
-          <w:color w:val="000000"/>
-          <w:sz w:val="30"/>
-          <w:szCs w:val="30"/>
-          <w:rtl/>
-        </w:rPr>
-        <w:t xml:space="preserve">5.9  حدود الادعاء: ما يثبته هذا الفصل وما لا يثبته</w:t>
-      </w:r>
-    </w:p>
-    <w:p>
-      <w:pPr>
-        <w:bidi/>
-        <w:rPr>
-          <w:rFonts w:ascii="Sakkal Majalla" w:hAnsi="Sakkal Majalla" w:cs="Sakkal Majalla"/>
-        </w:rPr>
-      </w:pPr>
-      <w:r>
-        <w:rPr>
-          <w:rFonts w:ascii="Sakkal Majalla" w:hAnsi="Sakkal Majalla" w:cs="Sakkal Majalla"/>
-          <w:color w:val="000000"/>
-          <w:sz w:val="30"/>
-          <w:szCs w:val="30"/>
-          <w:rtl/>
-        </w:rPr>
-        <w:t xml:space="preserve">5.10  قائمة المراجع المذكورة في هذا الفصل</w:t>
-      </w:r>
-    </w:p>
-    <w:p>
-      <w:pPr>
-        <w:bidi/>
-        <w:rPr>
-          <w:rFonts w:ascii="Sakkal Majalla" w:hAnsi="Sakkal Majalla" w:cs="Sakkal Majalla"/>
-        </w:rPr>
-      </w:pPr>
-      <w:r>
-        <w:rPr>
-          <w:rFonts w:ascii="Sakkal Majalla" w:hAnsi="Sakkal Majalla" w:cs="Sakkal Majalla"/>
-          <w:b/>
-          <w:bCs/>
-          <w:color w:val="156082"/>
-          <w:sz w:val="30"/>
-          <w:szCs w:val="30"/>
-          <w:rtl/>
-        </w:rPr>
-        <w:t xml:space="preserve">الفصل السادس: بروتوكول القراءة القرآنية الثماني، ثماني خطوات إلزامية قبل دخول سلم الاشتقاق: من القراءة العابرة إلى القراءة الموثوقة</w:t>
-      </w:r>
-    </w:p>
-    <w:p>
-      <w:pPr>
-        <w:bidi/>
-        <w:rPr>
-          <w:rFonts w:ascii="Sakkal Majalla" w:hAnsi="Sakkal Majalla" w:cs="Sakkal Majalla"/>
-        </w:rPr>
-      </w:pPr>
-      <w:r>
-        <w:rPr>
-          <w:rFonts w:ascii="Sakkal Majalla" w:hAnsi="Sakkal Majalla" w:cs="Sakkal Majalla"/>
-          <w:color w:val="000000"/>
-          <w:sz w:val="30"/>
-          <w:szCs w:val="30"/>
-          <w:rtl/>
-        </w:rPr>
-        <w:t xml:space="preserve">6.1  لماذا نحتاج إلى بروتوكول قراءة مقنَّن: مشكلة الدائرة التأويلية</w:t>
-      </w:r>
-    </w:p>
-    <w:p>
-      <w:pPr>
-        <w:bidi/>
-        <w:rPr>
-          <w:rFonts w:ascii="Sakkal Majalla" w:hAnsi="Sakkal Majalla" w:cs="Sakkal Majalla"/>
-        </w:rPr>
-      </w:pPr>
-      <w:r>
-        <w:rPr>
-          <w:rFonts w:ascii="Sakkal Majalla" w:hAnsi="Sakkal Majalla" w:cs="Sakkal Majalla"/>
-          <w:color w:val="000000"/>
-          <w:sz w:val="30"/>
-          <w:szCs w:val="30"/>
-          <w:rtl/>
-        </w:rPr>
-        <w:t xml:space="preserve">6.2  الخطوات الثماني الإلزامية: تعريف إجرائي وناتج متوقع لكل خطوة</w:t>
-      </w:r>
-    </w:p>
-    <w:p>
-      <w:pPr>
-        <w:bidi/>
-        <w:rPr>
-          <w:rFonts w:ascii="Sakkal Majalla" w:hAnsi="Sakkal Majalla" w:cs="Sakkal Majalla"/>
-        </w:rPr>
-      </w:pPr>
-      <w:r>
-        <w:rPr>
-          <w:rFonts w:ascii="Sakkal Majalla" w:hAnsi="Sakkal Majalla" w:cs="Sakkal Majalla"/>
-          <w:color w:val="000000"/>
-          <w:sz w:val="30"/>
-          <w:szCs w:val="30"/>
-          <w:rtl/>
-        </w:rPr>
-        <w:t xml:space="preserve">6.3  المحكم والمتشابه والمثاني: الخطوة الأكثر إغفالًا في الأدبيات المعاصرة</w:t>
-      </w:r>
-    </w:p>
-    <w:p>
-      <w:pPr>
-        <w:bidi/>
-        <w:rPr>
-          <w:rFonts w:ascii="Sakkal Majalla" w:hAnsi="Sakkal Majalla" w:cs="Sakkal Majalla"/>
-        </w:rPr>
-      </w:pPr>
-      <w:r>
-        <w:rPr>
-          <w:rFonts w:ascii="Sakkal Majalla" w:hAnsi="Sakkal Majalla" w:cs="Sakkal Majalla"/>
-          <w:color w:val="000000"/>
-          <w:sz w:val="30"/>
-          <w:szCs w:val="30"/>
-          <w:rtl/>
-        </w:rPr>
-        <w:t xml:space="preserve">6.4  الاستقراء الموضوعي: خطوات مصطفى مسلم</w:t>
-      </w:r>
-    </w:p>
-    <w:p>
-      <w:pPr>
-        <w:bidi/>
-        <w:rPr>
-          <w:rFonts w:ascii="Sakkal Majalla" w:hAnsi="Sakkal Majalla" w:cs="Sakkal Majalla"/>
-        </w:rPr>
-      </w:pPr>
-      <w:r>
-        <w:rPr>
-          <w:rFonts w:ascii="Sakkal Majalla" w:hAnsi="Sakkal Majalla" w:cs="Sakkal Majalla"/>
-          <w:color w:val="000000"/>
-          <w:sz w:val="30"/>
-          <w:szCs w:val="30"/>
-          <w:rtl/>
-        </w:rPr>
-        <w:t xml:space="preserve">6.5  الخطوات الاختيارية: متى تُفعَّل ولماذا لم تُجعل إلزامية</w:t>
-      </w:r>
-    </w:p>
-    <w:p>
-      <w:pPr>
-        <w:bidi/>
-        <w:rPr>
-          <w:rFonts w:ascii="Sakkal Majalla" w:hAnsi="Sakkal Majalla" w:cs="Sakkal Majalla"/>
-        </w:rPr>
-      </w:pPr>
-      <w:r>
-        <w:rPr>
-          <w:rFonts w:ascii="Sakkal Majalla" w:hAnsi="Sakkal Majalla" w:cs="Sakkal Majalla"/>
-          <w:color w:val="000000"/>
-          <w:sz w:val="30"/>
-          <w:szCs w:val="30"/>
-          <w:rtl/>
-        </w:rPr>
-        <w:t xml:space="preserve">6.6  المحظورات الصريحة: الحد بين الاجتهاد المشروع والانحراف المنهجي</w:t>
-      </w:r>
-    </w:p>
-    <w:p>
-      <w:pPr>
-        <w:bidi/>
-        <w:rPr>
-          <w:rFonts w:ascii="Sakkal Majalla" w:hAnsi="Sakkal Majalla" w:cs="Sakkal Majalla"/>
-        </w:rPr>
-      </w:pPr>
-      <w:r>
-        <w:rPr>
-          <w:rFonts w:ascii="Sakkal Majalla" w:hAnsi="Sakkal Majalla" w:cs="Sakkal Majalla"/>
-          <w:color w:val="000000"/>
-          <w:sz w:val="30"/>
-          <w:szCs w:val="30"/>
-          <w:rtl/>
-        </w:rPr>
-        <w:t xml:space="preserve">6.7  تطبيق كامل: البروتوكول الثماني على آية الإحسان</w:t>
-      </w:r>
-    </w:p>
-    <w:p>
-      <w:pPr>
-        <w:bidi/>
-        <w:rPr>
-          <w:rFonts w:ascii="Sakkal Majalla" w:hAnsi="Sakkal Majalla" w:cs="Sakkal Majalla"/>
-        </w:rPr>
-      </w:pPr>
-      <w:r>
-        <w:rPr>
-          <w:rFonts w:ascii="Sakkal Majalla" w:hAnsi="Sakkal Majalla" w:cs="Sakkal Majalla"/>
-          <w:color w:val="000000"/>
-          <w:sz w:val="30"/>
-          <w:szCs w:val="30"/>
-          <w:rtl/>
-        </w:rPr>
-        <w:t xml:space="preserve">6.8  مقارنة فلسفية: البروتوكول ونظريات صحة التأويل الغربية</w:t>
-      </w:r>
-    </w:p>
-    <w:p>
-      <w:pPr>
-        <w:bidi/>
-        <w:rPr>
-          <w:rFonts w:ascii="Sakkal Majalla" w:hAnsi="Sakkal Majalla" w:cs="Sakkal Majalla"/>
-        </w:rPr>
-      </w:pPr>
-      <w:r>
-        <w:rPr>
-          <w:rFonts w:ascii="Sakkal Majalla" w:hAnsi="Sakkal Majalla" w:cs="Sakkal Majalla"/>
-          <w:color w:val="000000"/>
-          <w:sz w:val="30"/>
-          <w:szCs w:val="30"/>
-          <w:rtl/>
-        </w:rPr>
-        <w:t xml:space="preserve">6.9  أربعة اعتراضات على البروتوكول</w:t>
-      </w:r>
-    </w:p>
-    <w:p>
-      <w:pPr>
-        <w:bidi/>
-        <w:rPr>
-          <w:rFonts w:ascii="Sakkal Majalla" w:hAnsi="Sakkal Majalla" w:cs="Sakkal Majalla"/>
-        </w:rPr>
-      </w:pPr>
-      <w:r>
-        <w:rPr>
-          <w:rFonts w:ascii="Sakkal Majalla" w:hAnsi="Sakkal Majalla" w:cs="Sakkal Majalla"/>
-          <w:color w:val="000000"/>
-          <w:sz w:val="30"/>
-          <w:szCs w:val="30"/>
-          <w:rtl/>
-        </w:rPr>
-        <w:t xml:space="preserve">6.10  قائمة تحقق سريعة للاستخدام اليومي</w:t>
-      </w:r>
-    </w:p>
-    <w:p>
-      <w:pPr>
-        <w:bidi/>
-        <w:rPr>
-          <w:rFonts w:ascii="Sakkal Majalla" w:hAnsi="Sakkal Majalla" w:cs="Sakkal Majalla"/>
-        </w:rPr>
-      </w:pPr>
-      <w:r>
-        <w:rPr>
-          <w:rFonts w:ascii="Sakkal Majalla" w:hAnsi="Sakkal Majalla" w:cs="Sakkal Majalla"/>
-          <w:color w:val="000000"/>
-          <w:sz w:val="30"/>
-          <w:szCs w:val="30"/>
-          <w:rtl/>
-        </w:rPr>
-        <w:t xml:space="preserve">6.11  حدود الادعاء: ما يثبته هذا الفصل وما لا يثبته</w:t>
-      </w:r>
-    </w:p>
-    <w:p>
-      <w:pPr>
-        <w:bidi/>
-        <w:rPr>
-          <w:rFonts w:ascii="Sakkal Majalla" w:hAnsi="Sakkal Majalla" w:cs="Sakkal Majalla"/>
-        </w:rPr>
-      </w:pPr>
-      <w:r>
-        <w:rPr>
-          <w:rFonts w:ascii="Sakkal Majalla" w:hAnsi="Sakkal Majalla" w:cs="Sakkal Majalla"/>
-          <w:color w:val="000000"/>
-          <w:sz w:val="30"/>
-          <w:szCs w:val="30"/>
-          <w:rtl/>
-        </w:rPr>
-        <w:t xml:space="preserve">6.12  قائمة المراجع المذكورة في هذا الفصل</w:t>
-      </w:r>
-    </w:p>
-    <w:p>
-      <w:pPr>
-        <w:bidi/>
-        <w:rPr>
-          <w:rFonts w:ascii="Sakkal Majalla" w:hAnsi="Sakkal Majalla" w:cs="Sakkal Majalla"/>
-        </w:rPr>
-      </w:pPr>
-      <w:r>
-        <w:rPr>
-          <w:rFonts w:ascii="Sakkal Majalla" w:hAnsi="Sakkal Majalla" w:cs="Sakkal Majalla"/>
-          <w:b/>
-          <w:bCs/>
-          <w:color w:val="156082"/>
-          <w:sz w:val="30"/>
-          <w:szCs w:val="30"/>
-          <w:rtl/>
-        </w:rPr>
-        <w:t xml:space="preserve">الفصل السابع: آلية فض التعارض بين النص والتجربة، حين يصطدم النموذج الإداري بالواقع: من الشذوذ الأول إلى القرار النهائي</w:t>
-      </w:r>
-    </w:p>
-    <w:p>
-      <w:pPr>
-        <w:bidi/>
-        <w:rPr>
-          <w:rFonts w:ascii="Sakkal Majalla" w:hAnsi="Sakkal Majalla" w:cs="Sakkal Majalla"/>
-        </w:rPr>
-      </w:pPr>
-      <w:r>
-        <w:rPr>
-          <w:rFonts w:ascii="Sakkal Majalla" w:hAnsi="Sakkal Majalla" w:cs="Sakkal Majalla"/>
-          <w:color w:val="000000"/>
-          <w:sz w:val="30"/>
-          <w:szCs w:val="30"/>
-          <w:rtl/>
-        </w:rPr>
-        <w:t xml:space="preserve">7.1  إشكالية دوهيم-كواين: حين يفشل الاختبار، فمن نحاسب؟</w:t>
-      </w:r>
-    </w:p>
-    <w:p>
-      <w:pPr>
-        <w:bidi/>
-        <w:rPr>
-          <w:rFonts w:ascii="Sakkal Majalla" w:hAnsi="Sakkal Majalla" w:cs="Sakkal Majalla"/>
-        </w:rPr>
-      </w:pPr>
-      <w:r>
-        <w:rPr>
-          <w:rFonts w:ascii="Sakkal Majalla" w:hAnsi="Sakkal Majalla" w:cs="Sakkal Majalla"/>
-          <w:color w:val="000000"/>
-          <w:sz w:val="30"/>
-          <w:szCs w:val="30"/>
-          <w:rtl/>
-        </w:rPr>
-        <w:t xml:space="preserve">7.2  التأصيل الأصولي: تعارض الأدلة عند الشافعي والزركشي</w:t>
-      </w:r>
-    </w:p>
-    <w:p>
-      <w:pPr>
-        <w:bidi/>
-        <w:rPr>
-          <w:rFonts w:ascii="Sakkal Majalla" w:hAnsi="Sakkal Majalla" w:cs="Sakkal Majalla"/>
-        </w:rPr>
-      </w:pPr>
-      <w:r>
-        <w:rPr>
-          <w:rFonts w:ascii="Sakkal Majalla" w:hAnsi="Sakkal Majalla" w:cs="Sakkal Majalla"/>
-          <w:color w:val="000000"/>
-          <w:sz w:val="30"/>
-          <w:szCs w:val="30"/>
-          <w:rtl/>
-        </w:rPr>
-        <w:t xml:space="preserve">7.3  أربعة أنواع من التعارض: التصنيف قبل الحل</w:t>
-      </w:r>
-    </w:p>
-    <w:p>
-      <w:pPr>
-        <w:bidi/>
-        <w:rPr>
-          <w:rFonts w:ascii="Sakkal Majalla" w:hAnsi="Sakkal Majalla" w:cs="Sakkal Majalla"/>
-        </w:rPr>
-      </w:pPr>
-      <w:r>
-        <w:rPr>
-          <w:rFonts w:ascii="Sakkal Majalla" w:hAnsi="Sakkal Majalla" w:cs="Sakkal Majalla"/>
-          <w:color w:val="000000"/>
-          <w:sz w:val="30"/>
-          <w:szCs w:val="30"/>
-          <w:rtl/>
-        </w:rPr>
-        <w:t xml:space="preserve">7.4  خوارزمية فض التعارض: من التصنيف إلى القرار</w:t>
-      </w:r>
-    </w:p>
-    <w:p>
-      <w:pPr>
-        <w:bidi/>
-        <w:rPr>
-          <w:rFonts w:ascii="Sakkal Majalla" w:hAnsi="Sakkal Majalla" w:cs="Sakkal Majalla"/>
-        </w:rPr>
-      </w:pPr>
-      <w:r>
-        <w:rPr>
-          <w:rFonts w:ascii="Sakkal Majalla" w:hAnsi="Sakkal Majalla" w:cs="Sakkal Majalla"/>
-          <w:color w:val="000000"/>
-          <w:sz w:val="30"/>
-          <w:szCs w:val="30"/>
-          <w:rtl/>
-        </w:rPr>
-        <w:t xml:space="preserve">7.5  ثلاثة تطبيقات: فشل كامل، وتقييد نطاق، ونجاح بلا أصالة</w:t>
-      </w:r>
-    </w:p>
-    <w:p>
-      <w:pPr>
-        <w:bidi/>
-        <w:rPr>
-          <w:rFonts w:ascii="Sakkal Majalla" w:hAnsi="Sakkal Majalla" w:cs="Sakkal Majalla"/>
-        </w:rPr>
-      </w:pPr>
-      <w:r>
-        <w:rPr>
-          <w:rFonts w:ascii="Sakkal Majalla" w:hAnsi="Sakkal Majalla" w:cs="Sakkal Majalla"/>
-          <w:color w:val="000000"/>
-          <w:sz w:val="30"/>
-          <w:szCs w:val="30"/>
-          <w:rtl/>
-        </w:rPr>
-        <w:t xml:space="preserve">7.6  مقارنة فلسفية: كون ولاكاتوش وهذا الفصل</w:t>
-      </w:r>
-    </w:p>
-    <w:p>
-      <w:pPr>
-        <w:bidi/>
-        <w:rPr>
-          <w:rFonts w:ascii="Sakkal Majalla" w:hAnsi="Sakkal Majalla" w:cs="Sakkal Majalla"/>
-        </w:rPr>
-      </w:pPr>
-      <w:r>
-        <w:rPr>
-          <w:rFonts w:ascii="Sakkal Majalla" w:hAnsi="Sakkal Majalla" w:cs="Sakkal Majalla"/>
-          <w:color w:val="000000"/>
-          <w:sz w:val="30"/>
-          <w:szCs w:val="30"/>
-          <w:rtl/>
-        </w:rPr>
-        <w:t xml:space="preserve">7.7  فخ اللاقابلية للتكذيب: كيف يتجنبه الفصل عمليًا</w:t>
-      </w:r>
-    </w:p>
-    <w:p>
-      <w:pPr>
-        <w:bidi/>
-        <w:rPr>
-          <w:rFonts w:ascii="Sakkal Majalla" w:hAnsi="Sakkal Majalla" w:cs="Sakkal Majalla"/>
-        </w:rPr>
-      </w:pPr>
-      <w:r>
-        <w:rPr>
-          <w:rFonts w:ascii="Sakkal Majalla" w:hAnsi="Sakkal Majalla" w:cs="Sakkal Majalla"/>
-          <w:color w:val="000000"/>
-          <w:sz w:val="30"/>
-          <w:szCs w:val="30"/>
-          <w:rtl/>
-        </w:rPr>
-        <w:t xml:space="preserve">7.8  أربعة اعتراضات على آلية فض التعارض</w:t>
-      </w:r>
-    </w:p>
-    <w:p>
-      <w:pPr>
-        <w:bidi/>
-        <w:rPr>
-          <w:rFonts w:ascii="Sakkal Majalla" w:hAnsi="Sakkal Majalla" w:cs="Sakkal Majalla"/>
-        </w:rPr>
-      </w:pPr>
-      <w:r>
-        <w:rPr>
-          <w:rFonts w:ascii="Sakkal Majalla" w:hAnsi="Sakkal Majalla" w:cs="Sakkal Majalla"/>
-          <w:color w:val="000000"/>
-          <w:sz w:val="30"/>
-          <w:szCs w:val="30"/>
-          <w:rtl/>
-        </w:rPr>
-        <w:t xml:space="preserve">7.9  قائمة تحقق سريعة لفض التعارض</w:t>
-      </w:r>
-    </w:p>
-    <w:p>
-      <w:pPr>
-        <w:bidi/>
-        <w:rPr>
-          <w:rFonts w:ascii="Sakkal Majalla" w:hAnsi="Sakkal Majalla" w:cs="Sakkal Majalla"/>
-        </w:rPr>
-      </w:pPr>
-      <w:r>
-        <w:rPr>
-          <w:rFonts w:ascii="Sakkal Majalla" w:hAnsi="Sakkal Majalla" w:cs="Sakkal Majalla"/>
-          <w:color w:val="000000"/>
-          <w:sz w:val="30"/>
-          <w:szCs w:val="30"/>
-          <w:rtl/>
-        </w:rPr>
-        <w:t xml:space="preserve">7.10  حدود الادعاء: ما يثبته هذا الفصل وما لا يثبته</w:t>
-      </w:r>
-    </w:p>
-    <w:p>
-      <w:pPr>
-        <w:bidi/>
-        <w:rPr>
-          <w:rFonts w:ascii="Sakkal Majalla" w:hAnsi="Sakkal Majalla" w:cs="Sakkal Majalla"/>
-        </w:rPr>
-      </w:pPr>
-      <w:r>
-        <w:rPr>
-          <w:rFonts w:ascii="Sakkal Majalla" w:hAnsi="Sakkal Majalla" w:cs="Sakkal Majalla"/>
-          <w:color w:val="000000"/>
-          <w:sz w:val="30"/>
-          <w:szCs w:val="30"/>
-          <w:rtl/>
-        </w:rPr>
-        <w:t xml:space="preserve">7.11  قائمة المراجع المذكورة في هذا الفصل</w:t>
-      </w:r>
-    </w:p>
-    <w:p>
-      <w:pPr>
-        <w:bidi/>
-        <w:rPr>
-          <w:rFonts w:ascii="Sakkal Majalla" w:hAnsi="Sakkal Majalla" w:cs="Sakkal Majalla"/>
-        </w:rPr>
-      </w:pPr>
-      <w:r>
-        <w:rPr>
-          <w:rFonts w:ascii="Sakkal Majalla" w:hAnsi="Sakkal Majalla" w:cs="Sakkal Majalla"/>
-          <w:b/>
-          <w:bCs/>
-          <w:color w:val="156082"/>
-          <w:sz w:val="30"/>
-          <w:szCs w:val="30"/>
-          <w:rtl/>
-        </w:rPr>
-        <w:t xml:space="preserve">الفصل الثامن: التصور القرآني للإنسان، مُستخلَف، مُكلَّف بالوسع، مُبتلى: ثلاثة مفاهيم قرآنية تبني الأنثروبولوجيا الإدارية الأصيلة</w:t>
-      </w:r>
-    </w:p>
-    <w:p>
-      <w:pPr>
-        <w:bidi/>
-        <w:rPr>
-          <w:rFonts w:ascii="Sakkal Majalla" w:hAnsi="Sakkal Majalla" w:cs="Sakkal Majalla"/>
-        </w:rPr>
-      </w:pPr>
-      <w:r>
-        <w:rPr>
-          <w:rFonts w:ascii="Sakkal Majalla" w:hAnsi="Sakkal Majalla" w:cs="Sakkal Majalla"/>
-          <w:color w:val="000000"/>
-          <w:sz w:val="30"/>
-          <w:szCs w:val="30"/>
-          <w:rtl/>
-        </w:rPr>
-        <w:t xml:space="preserve">8.1  لماذا يبدأ الباب الثاني بتصور الإنسان، لا بالقيم ولا بالهيكل</w:t>
-      </w:r>
-    </w:p>
-    <w:p>
-      <w:pPr>
-        <w:bidi/>
-        <w:rPr>
-          <w:rFonts w:ascii="Sakkal Majalla" w:hAnsi="Sakkal Majalla" w:cs="Sakkal Majalla"/>
-        </w:rPr>
-      </w:pPr>
-      <w:r>
-        <w:rPr>
-          <w:rFonts w:ascii="Sakkal Majalla" w:hAnsi="Sakkal Majalla" w:cs="Sakkal Majalla"/>
-          <w:color w:val="000000"/>
-          <w:sz w:val="30"/>
-          <w:szCs w:val="30"/>
-          <w:rtl/>
-        </w:rPr>
-        <w:t xml:space="preserve">8.2  الركن الأول: الاستخلاف، بالبروتوكول الثماني كاملًا</w:t>
-      </w:r>
-    </w:p>
-    <w:p>
-      <w:pPr>
-        <w:bidi/>
-        <w:rPr>
-          <w:rFonts w:ascii="Sakkal Majalla" w:hAnsi="Sakkal Majalla" w:cs="Sakkal Majalla"/>
-        </w:rPr>
-      </w:pPr>
-      <w:r>
-        <w:rPr>
-          <w:rFonts w:ascii="Sakkal Majalla" w:hAnsi="Sakkal Majalla" w:cs="Sakkal Majalla"/>
-          <w:color w:val="000000"/>
-          <w:sz w:val="30"/>
-          <w:szCs w:val="30"/>
-          <w:rtl/>
-        </w:rPr>
-        <w:t xml:space="preserve">8.3  الركن الثاني: التكليف بالوسع، بالبروتوكول الثماني كاملًا</w:t>
-      </w:r>
-    </w:p>
-    <w:p>
-      <w:pPr>
-        <w:bidi/>
-        <w:rPr>
-          <w:rFonts w:ascii="Sakkal Majalla" w:hAnsi="Sakkal Majalla" w:cs="Sakkal Majalla"/>
-        </w:rPr>
-      </w:pPr>
-      <w:r>
-        <w:rPr>
-          <w:rFonts w:ascii="Sakkal Majalla" w:hAnsi="Sakkal Majalla" w:cs="Sakkal Majalla"/>
-          <w:color w:val="000000"/>
-          <w:sz w:val="30"/>
-          <w:szCs w:val="30"/>
-          <w:rtl/>
-        </w:rPr>
-        <w:t xml:space="preserve">8.4  الركن الثالث: الابتلاء، بالبروتوكول الثماني كاملًا</w:t>
-      </w:r>
-    </w:p>
-    <w:p>
-      <w:pPr>
-        <w:bidi/>
-        <w:rPr>
-          <w:rFonts w:ascii="Sakkal Majalla" w:hAnsi="Sakkal Majalla" w:cs="Sakkal Majalla"/>
-        </w:rPr>
-      </w:pPr>
-      <w:r>
-        <w:rPr>
-          <w:rFonts w:ascii="Sakkal Majalla" w:hAnsi="Sakkal Majalla" w:cs="Sakkal Majalla"/>
-          <w:color w:val="000000"/>
-          <w:sz w:val="30"/>
-          <w:szCs w:val="30"/>
-          <w:rtl/>
-        </w:rPr>
-        <w:t xml:space="preserve">8.5  التركيب: الإنسان القرآني مستخلَف، ومكلَّف بالوسع، ومبتلى</w:t>
-      </w:r>
-    </w:p>
-    <w:p>
-      <w:pPr>
-        <w:bidi/>
-        <w:rPr>
-          <w:rFonts w:ascii="Sakkal Majalla" w:hAnsi="Sakkal Majalla" w:cs="Sakkal Majalla"/>
-        </w:rPr>
-      </w:pPr>
-      <w:r>
-        <w:rPr>
-          <w:rFonts w:ascii="Sakkal Majalla" w:hAnsi="Sakkal Majalla" w:cs="Sakkal Majalla"/>
-          <w:color w:val="000000"/>
-          <w:sz w:val="30"/>
-          <w:szCs w:val="30"/>
-          <w:rtl/>
-        </w:rPr>
-        <w:t xml:space="preserve">8.6  حالة تطبيقية أولى: المدير المستخلَف في قرار تسريح جماعي</w:t>
-      </w:r>
-    </w:p>
-    <w:p>
-      <w:pPr>
-        <w:bidi/>
-        <w:rPr>
-          <w:rFonts w:ascii="Sakkal Majalla" w:hAnsi="Sakkal Majalla" w:cs="Sakkal Majalla"/>
-        </w:rPr>
-      </w:pPr>
-      <w:r>
-        <w:rPr>
-          <w:rFonts w:ascii="Sakkal Majalla" w:hAnsi="Sakkal Majalla" w:cs="Sakkal Majalla"/>
-          <w:color w:val="000000"/>
-          <w:sz w:val="30"/>
-          <w:szCs w:val="30"/>
-          <w:rtl/>
-        </w:rPr>
-        <w:t xml:space="preserve">8.7  حالة تطبيقية ثانية: نظام تقييم الأداء وفق الأركان الثلاثة</w:t>
-      </w:r>
-    </w:p>
-    <w:p>
-      <w:pPr>
-        <w:bidi/>
-        <w:rPr>
-          <w:rFonts w:ascii="Sakkal Majalla" w:hAnsi="Sakkal Majalla" w:cs="Sakkal Majalla"/>
-        </w:rPr>
-      </w:pPr>
-      <w:r>
-        <w:rPr>
-          <w:rFonts w:ascii="Sakkal Majalla" w:hAnsi="Sakkal Majalla" w:cs="Sakkal Majalla"/>
-          <w:color w:val="000000"/>
-          <w:sz w:val="30"/>
-          <w:szCs w:val="30"/>
-          <w:rtl/>
-        </w:rPr>
-        <w:t xml:space="preserve">8.8  الفرضية الصفرية: مقارنة أولية بنظرية أصحاب المصلحة وهرم ماسلو</w:t>
-      </w:r>
-    </w:p>
-    <w:p>
-      <w:pPr>
-        <w:bidi/>
-        <w:rPr>
-          <w:rFonts w:ascii="Sakkal Majalla" w:hAnsi="Sakkal Majalla" w:cs="Sakkal Majalla"/>
-        </w:rPr>
-      </w:pPr>
-      <w:r>
-        <w:rPr>
-          <w:rFonts w:ascii="Sakkal Majalla" w:hAnsi="Sakkal Majalla" w:cs="Sakkal Majalla"/>
-          <w:color w:val="000000"/>
-          <w:sz w:val="30"/>
-          <w:szCs w:val="30"/>
-          <w:rtl/>
-        </w:rPr>
-        <w:t xml:space="preserve">8.9  مقارنة معمّقة: الإنسان القرآني والأنثروبولوجيات الأربع</w:t>
-      </w:r>
-    </w:p>
-    <w:p>
-      <w:pPr>
-        <w:bidi/>
-        <w:rPr>
-          <w:rFonts w:ascii="Sakkal Majalla" w:hAnsi="Sakkal Majalla" w:cs="Sakkal Majalla"/>
-        </w:rPr>
-      </w:pPr>
-      <w:r>
-        <w:rPr>
-          <w:rFonts w:ascii="Sakkal Majalla" w:hAnsi="Sakkal Majalla" w:cs="Sakkal Majalla"/>
-          <w:color w:val="000000"/>
-          <w:sz w:val="30"/>
-          <w:szCs w:val="30"/>
-          <w:rtl/>
-        </w:rPr>
-        <w:t xml:space="preserve">8.10  خمسة اعتراضات على التصور القرآني للإنسان</w:t>
-      </w:r>
-    </w:p>
-    <w:p>
-      <w:pPr>
-        <w:bidi/>
-        <w:rPr>
-          <w:rFonts w:ascii="Sakkal Majalla" w:hAnsi="Sakkal Majalla" w:cs="Sakkal Majalla"/>
-        </w:rPr>
-      </w:pPr>
-      <w:r>
-        <w:rPr>
-          <w:rFonts w:ascii="Sakkal Majalla" w:hAnsi="Sakkal Majalla" w:cs="Sakkal Majalla"/>
-          <w:color w:val="000000"/>
-          <w:sz w:val="30"/>
-          <w:szCs w:val="30"/>
-          <w:rtl/>
-        </w:rPr>
-        <w:t xml:space="preserve">8.11  حدود الادعاء: ما يثبته هذا الفصل وما لا يثبته</w:t>
-      </w:r>
-    </w:p>
-    <w:p>
-      <w:pPr>
-        <w:bidi/>
-        <w:rPr>
-          <w:rFonts w:ascii="Sakkal Majalla" w:hAnsi="Sakkal Majalla" w:cs="Sakkal Majalla"/>
-        </w:rPr>
-      </w:pPr>
-      <w:r>
-        <w:rPr>
-          <w:rFonts w:ascii="Sakkal Majalla" w:hAnsi="Sakkal Majalla" w:cs="Sakkal Majalla"/>
-          <w:color w:val="000000"/>
-          <w:sz w:val="30"/>
-          <w:szCs w:val="30"/>
-          <w:rtl/>
-        </w:rPr>
-        <w:t xml:space="preserve">8.12  قائمة المراجع المذكورة في هذا الفصل</w:t>
-      </w:r>
-    </w:p>
-    <w:p>
-      <w:pPr>
-        <w:bidi/>
-        <w:rPr>
-          <w:rFonts w:ascii="Sakkal Majalla" w:hAnsi="Sakkal Majalla" w:cs="Sakkal Majalla"/>
-        </w:rPr>
-      </w:pPr>
-      <w:r>
-        <w:rPr>
-          <w:rFonts w:ascii="Sakkal Majalla" w:hAnsi="Sakkal Majalla" w:cs="Sakkal Majalla"/>
-          <w:b/>
-          <w:bCs/>
-          <w:color w:val="156082"/>
-          <w:sz w:val="30"/>
-          <w:szCs w:val="30"/>
-          <w:rtl/>
-        </w:rPr>
-        <w:t xml:space="preserve">الفصل التاسع: نظرية المعرفة القرآنية، فِطرة، تثبُّت، تدبُّر: ثلاثة مفاهيم قرآنية تبني الأنثروبولوجيا المعرفية للمدير</w:t>
-      </w:r>
-    </w:p>
-    <w:p>
-      <w:pPr>
-        <w:bidi/>
-        <w:rPr>
-          <w:rFonts w:ascii="Sakkal Majalla" w:hAnsi="Sakkal Majalla" w:cs="Sakkal Majalla"/>
-        </w:rPr>
-      </w:pPr>
-      <w:r>
-        <w:rPr>
-          <w:rFonts w:ascii="Sakkal Majalla" w:hAnsi="Sakkal Majalla" w:cs="Sakkal Majalla"/>
-          <w:color w:val="000000"/>
-          <w:sz w:val="30"/>
-          <w:szCs w:val="30"/>
-          <w:rtl/>
-        </w:rPr>
-        <w:t xml:space="preserve">9.1  لماذا نظرية المعرفة بعد تصور الإنسان؟ والمدارس الإبستيمولوجية الأربع</w:t>
-      </w:r>
-    </w:p>
-    <w:p>
-      <w:pPr>
-        <w:bidi/>
-        <w:rPr>
-          <w:rFonts w:ascii="Sakkal Majalla" w:hAnsi="Sakkal Majalla" w:cs="Sakkal Majalla"/>
-        </w:rPr>
-      </w:pPr>
-      <w:r>
-        <w:rPr>
-          <w:rFonts w:ascii="Sakkal Majalla" w:hAnsi="Sakkal Majalla" w:cs="Sakkal Majalla"/>
-          <w:color w:val="000000"/>
-          <w:sz w:val="30"/>
-          <w:szCs w:val="30"/>
-          <w:rtl/>
-        </w:rPr>
-        <w:t xml:space="preserve">9.2  الركن الأول: الفطرة، بالبروتوكول الثماني كاملًا</w:t>
-      </w:r>
-    </w:p>
-    <w:p>
-      <w:pPr>
-        <w:bidi/>
-        <w:rPr>
-          <w:rFonts w:ascii="Sakkal Majalla" w:hAnsi="Sakkal Majalla" w:cs="Sakkal Majalla"/>
-        </w:rPr>
-      </w:pPr>
-      <w:r>
-        <w:rPr>
-          <w:rFonts w:ascii="Sakkal Majalla" w:hAnsi="Sakkal Majalla" w:cs="Sakkal Majalla"/>
-          <w:color w:val="000000"/>
-          <w:sz w:val="30"/>
-          <w:szCs w:val="30"/>
-          <w:rtl/>
-        </w:rPr>
-        <w:t xml:space="preserve">9.3  الركن الثاني: التثبت، بالبروتوكول الثماني كاملًا</w:t>
-      </w:r>
-    </w:p>
-    <w:p>
-      <w:pPr>
-        <w:bidi/>
-        <w:rPr>
-          <w:rFonts w:ascii="Sakkal Majalla" w:hAnsi="Sakkal Majalla" w:cs="Sakkal Majalla"/>
-        </w:rPr>
-      </w:pPr>
-      <w:r>
-        <w:rPr>
-          <w:rFonts w:ascii="Sakkal Majalla" w:hAnsi="Sakkal Majalla" w:cs="Sakkal Majalla"/>
-          <w:color w:val="000000"/>
-          <w:sz w:val="30"/>
-          <w:szCs w:val="30"/>
-          <w:rtl/>
-        </w:rPr>
-        <w:t xml:space="preserve">9.4  الركن الثالث: التدبر، بالبروتوكول الثماني كاملًا</w:t>
-      </w:r>
-    </w:p>
-    <w:p>
-      <w:pPr>
-        <w:bidi/>
-        <w:rPr>
-          <w:rFonts w:ascii="Sakkal Majalla" w:hAnsi="Sakkal Majalla" w:cs="Sakkal Majalla"/>
-        </w:rPr>
-      </w:pPr>
-      <w:r>
-        <w:rPr>
-          <w:rFonts w:ascii="Sakkal Majalla" w:hAnsi="Sakkal Majalla" w:cs="Sakkal Majalla"/>
-          <w:color w:val="000000"/>
-          <w:sz w:val="30"/>
-          <w:szCs w:val="30"/>
-          <w:rtl/>
-        </w:rPr>
-        <w:t xml:space="preserve">9.5  التركيب: نظرية المعرفة القرآنية مصدر وتحقق وتعميق</w:t>
-      </w:r>
-    </w:p>
-    <w:p>
-      <w:pPr>
-        <w:bidi/>
-        <w:rPr>
-          <w:rFonts w:ascii="Sakkal Majalla" w:hAnsi="Sakkal Majalla" w:cs="Sakkal Majalla"/>
-        </w:rPr>
-      </w:pPr>
-      <w:r>
-        <w:rPr>
-          <w:rFonts w:ascii="Sakkal Majalla" w:hAnsi="Sakkal Majalla" w:cs="Sakkal Majalla"/>
-          <w:color w:val="000000"/>
-          <w:sz w:val="30"/>
-          <w:szCs w:val="30"/>
-          <w:rtl/>
-        </w:rPr>
-        <w:t xml:space="preserve">9.6  حالتان تطبيقيتان: قرار استراتيجي، والإبلاغ عن مخالفة</w:t>
-      </w:r>
-    </w:p>
-    <w:p>
-      <w:pPr>
-        <w:bidi/>
-        <w:rPr>
-          <w:rFonts w:ascii="Sakkal Majalla" w:hAnsi="Sakkal Majalla" w:cs="Sakkal Majalla"/>
-        </w:rPr>
-      </w:pPr>
-      <w:r>
-        <w:rPr>
-          <w:rFonts w:ascii="Sakkal Majalla" w:hAnsi="Sakkal Majalla" w:cs="Sakkal Majalla"/>
-          <w:color w:val="000000"/>
-          <w:sz w:val="30"/>
-          <w:szCs w:val="30"/>
-          <w:rtl/>
-        </w:rPr>
-        <w:t xml:space="preserve">9.7  الفرضية الصفرية: مقارنة أولية بسايمون وكانمان</w:t>
-      </w:r>
-    </w:p>
-    <w:p>
-      <w:pPr>
-        <w:bidi/>
-        <w:rPr>
-          <w:rFonts w:ascii="Sakkal Majalla" w:hAnsi="Sakkal Majalla" w:cs="Sakkal Majalla"/>
-        </w:rPr>
-      </w:pPr>
-      <w:r>
-        <w:rPr>
-          <w:rFonts w:ascii="Sakkal Majalla" w:hAnsi="Sakkal Majalla" w:cs="Sakkal Majalla"/>
-          <w:color w:val="000000"/>
-          <w:sz w:val="30"/>
-          <w:szCs w:val="30"/>
-          <w:rtl/>
-        </w:rPr>
-        <w:t xml:space="preserve">9.8  مقارنة معمّقة: النظرية الثلاثية والمدارس الإبستيمولوجية الأربع</w:t>
-      </w:r>
-    </w:p>
-    <w:p>
-      <w:pPr>
-        <w:bidi/>
-        <w:rPr>
-          <w:rFonts w:ascii="Sakkal Majalla" w:hAnsi="Sakkal Majalla" w:cs="Sakkal Majalla"/>
-        </w:rPr>
-      </w:pPr>
-      <w:r>
-        <w:rPr>
-          <w:rFonts w:ascii="Sakkal Majalla" w:hAnsi="Sakkal Majalla" w:cs="Sakkal Majalla"/>
-          <w:color w:val="000000"/>
-          <w:sz w:val="30"/>
-          <w:szCs w:val="30"/>
-          <w:rtl/>
-        </w:rPr>
-        <w:t xml:space="preserve">9.9  ستة اعتراضات على نظرية المعرفة القرآنية</w:t>
-      </w:r>
-    </w:p>
-    <w:p>
-      <w:pPr>
-        <w:bidi/>
-        <w:rPr>
-          <w:rFonts w:ascii="Sakkal Majalla" w:hAnsi="Sakkal Majalla" w:cs="Sakkal Majalla"/>
-        </w:rPr>
-      </w:pPr>
-      <w:r>
-        <w:rPr>
-          <w:rFonts w:ascii="Sakkal Majalla" w:hAnsi="Sakkal Majalla" w:cs="Sakkal Majalla"/>
-          <w:color w:val="000000"/>
-          <w:sz w:val="30"/>
-          <w:szCs w:val="30"/>
-          <w:rtl/>
-        </w:rPr>
-        <w:t xml:space="preserve">9.10  حدود الادعاء: ما يثبته هذا الفصل وما لا يثبته</w:t>
-      </w:r>
-    </w:p>
-    <w:p>
-      <w:pPr>
-        <w:bidi/>
-        <w:rPr>
-          <w:rFonts w:ascii="Sakkal Majalla" w:hAnsi="Sakkal Majalla" w:cs="Sakkal Majalla"/>
-        </w:rPr>
-      </w:pPr>
-      <w:r>
-        <w:rPr>
-          <w:rFonts w:ascii="Sakkal Majalla" w:hAnsi="Sakkal Majalla" w:cs="Sakkal Majalla"/>
-          <w:color w:val="000000"/>
-          <w:sz w:val="30"/>
-          <w:szCs w:val="30"/>
-          <w:rtl/>
-        </w:rPr>
-        <w:t xml:space="preserve">9.11  قائمة المراجع المذكورة في هذا الفصل</w:t>
-      </w:r>
-    </w:p>
-    <w:p>
-      <w:pPr>
-        <w:bidi/>
-        <w:rPr>
-          <w:rFonts w:ascii="Sakkal Majalla" w:hAnsi="Sakkal Majalla" w:cs="Sakkal Majalla"/>
-        </w:rPr>
-      </w:pPr>
-      <w:r>
-        <w:rPr>
-          <w:rFonts w:ascii="Sakkal Majalla" w:hAnsi="Sakkal Majalla" w:cs="Sakkal Majalla"/>
-          <w:b/>
-          <w:bCs/>
-          <w:color w:val="156082"/>
-          <w:sz w:val="30"/>
-          <w:szCs w:val="30"/>
-          <w:rtl/>
-        </w:rPr>
-        <w:t xml:space="preserve">الفصل العاشر: القيم الحاكمة واختبار التكامل الثلاثي، رحمة، حكمة، صدق، والمنظومة القيمية السباعية</w:t>
-      </w:r>
-    </w:p>
-    <w:p>
-      <w:pPr>
-        <w:bidi/>
-        <w:rPr>
-          <w:rFonts w:ascii="Sakkal Majalla" w:hAnsi="Sakkal Majalla" w:cs="Sakkal Majalla"/>
-        </w:rPr>
-      </w:pPr>
-      <w:r>
-        <w:rPr>
-          <w:rFonts w:ascii="Sakkal Majalla" w:hAnsi="Sakkal Majalla" w:cs="Sakkal Majalla"/>
-          <w:color w:val="000000"/>
-          <w:sz w:val="30"/>
-          <w:szCs w:val="30"/>
-          <w:rtl/>
-        </w:rPr>
-        <w:t xml:space="preserve">10.1  لماذا القيم بعد المعرفة؟ وأربع نظريات أخلاقية غربية كبرى</w:t>
-      </w:r>
-    </w:p>
-    <w:p>
-      <w:pPr>
-        <w:bidi/>
-        <w:rPr>
-          <w:rFonts w:ascii="Sakkal Majalla" w:hAnsi="Sakkal Majalla" w:cs="Sakkal Majalla"/>
-        </w:rPr>
-      </w:pPr>
-      <w:r>
-        <w:rPr>
-          <w:rFonts w:ascii="Sakkal Majalla" w:hAnsi="Sakkal Majalla" w:cs="Sakkal Majalla"/>
-          <w:color w:val="000000"/>
-          <w:sz w:val="30"/>
-          <w:szCs w:val="30"/>
-          <w:rtl/>
-        </w:rPr>
-        <w:t xml:space="preserve">10.2  الركن الأول: الرحمة الفاعلة، بالبروتوكول الثماني كاملًا</w:t>
-      </w:r>
-    </w:p>
-    <w:p>
-      <w:pPr>
-        <w:bidi/>
-        <w:rPr>
-          <w:rFonts w:ascii="Sakkal Majalla" w:hAnsi="Sakkal Majalla" w:cs="Sakkal Majalla"/>
-        </w:rPr>
-      </w:pPr>
-      <w:r>
-        <w:rPr>
-          <w:rFonts w:ascii="Sakkal Majalla" w:hAnsi="Sakkal Majalla" w:cs="Sakkal Majalla"/>
-          <w:color w:val="000000"/>
-          <w:sz w:val="30"/>
-          <w:szCs w:val="30"/>
-          <w:rtl/>
-        </w:rPr>
-        <w:t xml:space="preserve">10.3  الركن الثاني: الحكمة التطبيقية، بالبروتوكول الثماني كاملًا</w:t>
-      </w:r>
-    </w:p>
-    <w:p>
-      <w:pPr>
-        <w:bidi/>
-        <w:rPr>
-          <w:rFonts w:ascii="Sakkal Majalla" w:hAnsi="Sakkal Majalla" w:cs="Sakkal Majalla"/>
-        </w:rPr>
-      </w:pPr>
-      <w:r>
-        <w:rPr>
-          <w:rFonts w:ascii="Sakkal Majalla" w:hAnsi="Sakkal Majalla" w:cs="Sakkal Majalla"/>
-          <w:color w:val="000000"/>
-          <w:sz w:val="30"/>
-          <w:szCs w:val="30"/>
-          <w:rtl/>
-        </w:rPr>
-        <w:t xml:space="preserve">10.4  الركن الثالث: الصدق الثلاثي، بالبروتوكول الثماني كاملًا</w:t>
-      </w:r>
-    </w:p>
-    <w:p>
-      <w:pPr>
-        <w:bidi/>
-        <w:rPr>
-          <w:rFonts w:ascii="Sakkal Majalla" w:hAnsi="Sakkal Majalla" w:cs="Sakkal Majalla"/>
-        </w:rPr>
-      </w:pPr>
-      <w:r>
-        <w:rPr>
-          <w:rFonts w:ascii="Sakkal Majalla" w:hAnsi="Sakkal Majalla" w:cs="Sakkal Majalla"/>
-          <w:color w:val="000000"/>
-          <w:sz w:val="30"/>
-          <w:szCs w:val="30"/>
-          <w:rtl/>
-        </w:rPr>
-        <w:t xml:space="preserve">10.5  التركيب: المنظومة القيمية السباعية</w:t>
-      </w:r>
-    </w:p>
-    <w:p>
-      <w:pPr>
-        <w:bidi/>
-        <w:rPr>
-          <w:rFonts w:ascii="Sakkal Majalla" w:hAnsi="Sakkal Majalla" w:cs="Sakkal Majalla"/>
-        </w:rPr>
-      </w:pPr>
-      <w:r>
-        <w:rPr>
-          <w:rFonts w:ascii="Sakkal Majalla" w:hAnsi="Sakkal Majalla" w:cs="Sakkal Majalla"/>
-          <w:color w:val="000000"/>
-          <w:sz w:val="30"/>
-          <w:szCs w:val="30"/>
-          <w:rtl/>
-        </w:rPr>
-        <w:t xml:space="preserve">10.6  ثلاث حالات تطبيقية: المنظومة في العمل</w:t>
-      </w:r>
-    </w:p>
-    <w:p>
-      <w:pPr>
-        <w:bidi/>
-        <w:rPr>
-          <w:rFonts w:ascii="Sakkal Majalla" w:hAnsi="Sakkal Majalla" w:cs="Sakkal Majalla"/>
-        </w:rPr>
-      </w:pPr>
-      <w:r>
-        <w:rPr>
-          <w:rFonts w:ascii="Sakkal Majalla" w:hAnsi="Sakkal Majalla" w:cs="Sakkal Majalla"/>
-          <w:color w:val="000000"/>
-          <w:sz w:val="30"/>
-          <w:szCs w:val="30"/>
-          <w:rtl/>
-        </w:rPr>
-        <w:t xml:space="preserve">10.7  مقارنة أولية بمحكّات الفرضية الصفرية: المنظومة أمام أرسطو ومِل</w:t>
-      </w:r>
-    </w:p>
-    <w:p>
-      <w:pPr>
-        <w:bidi/>
-        <w:rPr>
-          <w:rFonts w:ascii="Sakkal Majalla" w:hAnsi="Sakkal Majalla" w:cs="Sakkal Majalla"/>
-        </w:rPr>
-      </w:pPr>
-      <w:r>
-        <w:rPr>
-          <w:rFonts w:ascii="Sakkal Majalla" w:hAnsi="Sakkal Majalla" w:cs="Sakkal Majalla"/>
-          <w:color w:val="000000"/>
-          <w:sz w:val="30"/>
-          <w:szCs w:val="30"/>
-          <w:rtl/>
-        </w:rPr>
-        <w:t xml:space="preserve">10.8  مقارنة معمَّقة: المنظومة والنظريات الأربع وتقاليد دينية أخرى</w:t>
-      </w:r>
-    </w:p>
-    <w:p>
-      <w:pPr>
-        <w:bidi/>
-        <w:rPr>
-          <w:rFonts w:ascii="Sakkal Majalla" w:hAnsi="Sakkal Majalla" w:cs="Sakkal Majalla"/>
-        </w:rPr>
-      </w:pPr>
-      <w:r>
-        <w:rPr>
-          <w:rFonts w:ascii="Sakkal Majalla" w:hAnsi="Sakkal Majalla" w:cs="Sakkal Majalla"/>
-          <w:color w:val="000000"/>
-          <w:sz w:val="30"/>
-          <w:szCs w:val="30"/>
-          <w:rtl/>
-        </w:rPr>
-        <w:t xml:space="preserve">10.9  تعارض القيم: حين تتصادم الرحمة والعدل</w:t>
-      </w:r>
-    </w:p>
-    <w:p>
-      <w:pPr>
-        <w:bidi/>
-        <w:rPr>
-          <w:rFonts w:ascii="Sakkal Majalla" w:hAnsi="Sakkal Majalla" w:cs="Sakkal Majalla"/>
-        </w:rPr>
-      </w:pPr>
-      <w:r>
-        <w:rPr>
-          <w:rFonts w:ascii="Sakkal Majalla" w:hAnsi="Sakkal Majalla" w:cs="Sakkal Majalla"/>
-          <w:color w:val="000000"/>
-          <w:sz w:val="30"/>
-          <w:szCs w:val="30"/>
-          <w:rtl/>
-        </w:rPr>
-        <w:t xml:space="preserve">10.10  سبعة اعتراضات على المنظومة القيمية</w:t>
-      </w:r>
-    </w:p>
-    <w:p>
-      <w:pPr>
-        <w:bidi/>
-        <w:rPr>
-          <w:rFonts w:ascii="Sakkal Majalla" w:hAnsi="Sakkal Majalla" w:cs="Sakkal Majalla"/>
-        </w:rPr>
-      </w:pPr>
-      <w:r>
-        <w:rPr>
-          <w:rFonts w:ascii="Sakkal Majalla" w:hAnsi="Sakkal Majalla" w:cs="Sakkal Majalla"/>
-          <w:color w:val="000000"/>
-          <w:sz w:val="30"/>
-          <w:szCs w:val="30"/>
-          <w:rtl/>
-        </w:rPr>
-        <w:t xml:space="preserve">10.11  حدود الادعاء: ما يثبته هذا الفصل وما لا يثبته</w:t>
-      </w:r>
-    </w:p>
-    <w:p>
-      <w:pPr>
-        <w:bidi/>
-        <w:rPr>
-          <w:rFonts w:ascii="Sakkal Majalla" w:hAnsi="Sakkal Majalla" w:cs="Sakkal Majalla"/>
-        </w:rPr>
-      </w:pPr>
-      <w:r>
-        <w:rPr>
-          <w:rFonts w:ascii="Sakkal Majalla" w:hAnsi="Sakkal Majalla" w:cs="Sakkal Majalla"/>
-          <w:color w:val="000000"/>
-          <w:sz w:val="30"/>
-          <w:szCs w:val="30"/>
-          <w:rtl/>
-        </w:rPr>
-        <w:t xml:space="preserve">10.12  قائمة المراجع المذكورة في هذا الفصل</w:t>
-      </w:r>
-    </w:p>
-    <w:p>
-      <w:pPr>
-        <w:bidi/>
-        <w:rPr>
-          <w:rFonts w:ascii="Sakkal Majalla" w:hAnsi="Sakkal Majalla" w:cs="Sakkal Majalla"/>
-        </w:rPr>
-      </w:pPr>
-      <w:r>
-        <w:rPr>
-          <w:rFonts w:ascii="Sakkal Majalla" w:hAnsi="Sakkal Majalla" w:cs="Sakkal Majalla"/>
-          <w:b/>
-          <w:bCs/>
-          <w:color w:val="156082"/>
-          <w:sz w:val="30"/>
-          <w:szCs w:val="30"/>
-          <w:rtl/>
-        </w:rPr>
-        <w:t xml:space="preserve">الفصل الحادي عشر: QMF، الإطار المعرفي للإدارة القرآنية، كيف تجتمع الأسس الثلاثة عشر في بنية واحدة؟</w:t>
-      </w:r>
-    </w:p>
-    <w:p>
-      <w:pPr>
-        <w:bidi/>
-        <w:rPr>
-          <w:rFonts w:ascii="Sakkal Majalla" w:hAnsi="Sakkal Majalla" w:cs="Sakkal Majalla"/>
-        </w:rPr>
-      </w:pPr>
-      <w:r>
-        <w:rPr>
-          <w:rFonts w:ascii="Sakkal Majalla" w:hAnsi="Sakkal Majalla" w:cs="Sakkal Majalla"/>
-          <w:color w:val="000000"/>
-          <w:sz w:val="30"/>
-          <w:szCs w:val="30"/>
-          <w:rtl/>
-        </w:rPr>
-        <w:t xml:space="preserve">11.1  لماذا فصل بنيوي الآن؟ وأربعة أطر بنائية غربية كبرى</w:t>
-      </w:r>
-    </w:p>
-    <w:p>
-      <w:pPr>
-        <w:bidi/>
-        <w:rPr>
-          <w:rFonts w:ascii="Sakkal Majalla" w:hAnsi="Sakkal Majalla" w:cs="Sakkal Majalla"/>
-        </w:rPr>
-      </w:pPr>
-      <w:r>
-        <w:rPr>
-          <w:rFonts w:ascii="Sakkal Majalla" w:hAnsi="Sakkal Majalla" w:cs="Sakkal Majalla"/>
-          <w:color w:val="000000"/>
-          <w:sz w:val="30"/>
-          <w:szCs w:val="30"/>
-          <w:rtl/>
-        </w:rPr>
-        <w:t xml:space="preserve">11.2  السلسلة الثمانية: تعريف كل مكوّن ومصدره</w:t>
-      </w:r>
-    </w:p>
-    <w:p>
-      <w:pPr>
-        <w:bidi/>
-        <w:rPr>
-          <w:rFonts w:ascii="Sakkal Majalla" w:hAnsi="Sakkal Majalla" w:cs="Sakkal Majalla"/>
-        </w:rPr>
-      </w:pPr>
-      <w:r>
-        <w:rPr>
-          <w:rFonts w:ascii="Sakkal Majalla" w:hAnsi="Sakkal Majalla" w:cs="Sakkal Majalla"/>
-          <w:color w:val="000000"/>
-          <w:sz w:val="30"/>
-          <w:szCs w:val="30"/>
-          <w:rtl/>
-        </w:rPr>
-        <w:t xml:space="preserve">11.3  المكوّن الأول: الرؤية القرآنية الكلية</w:t>
-      </w:r>
-    </w:p>
-    <w:p>
-      <w:pPr>
-        <w:bidi/>
-        <w:rPr>
-          <w:rFonts w:ascii="Sakkal Majalla" w:hAnsi="Sakkal Majalla" w:cs="Sakkal Majalla"/>
-        </w:rPr>
-      </w:pPr>
-      <w:r>
-        <w:rPr>
-          <w:rFonts w:ascii="Sakkal Majalla" w:hAnsi="Sakkal Majalla" w:cs="Sakkal Majalla"/>
-          <w:color w:val="000000"/>
-          <w:sz w:val="30"/>
-          <w:szCs w:val="30"/>
-          <w:rtl/>
-        </w:rPr>
-        <w:t xml:space="preserve">11.4  المكوّن الخامس: الغاية، عمارة الأرض بالحق والرجوع إلى الله</w:t>
-      </w:r>
-    </w:p>
-    <w:p>
-      <w:pPr>
-        <w:bidi/>
-        <w:rPr>
-          <w:rFonts w:ascii="Sakkal Majalla" w:hAnsi="Sakkal Majalla" w:cs="Sakkal Majalla"/>
-        </w:rPr>
-      </w:pPr>
-      <w:r>
-        <w:rPr>
-          <w:rFonts w:ascii="Sakkal Majalla" w:hAnsi="Sakkal Majalla" w:cs="Sakkal Majalla"/>
-          <w:color w:val="000000"/>
-          <w:sz w:val="30"/>
-          <w:szCs w:val="30"/>
-          <w:rtl/>
-        </w:rPr>
-        <w:t xml:space="preserve">11.5  المكوّن السابع: المؤسسة، البنية والعلاقات والموارد</w:t>
-      </w:r>
-    </w:p>
-    <w:p>
-      <w:pPr>
-        <w:bidi/>
-        <w:rPr>
-          <w:rFonts w:ascii="Sakkal Majalla" w:hAnsi="Sakkal Majalla" w:cs="Sakkal Majalla"/>
-        </w:rPr>
-      </w:pPr>
-      <w:r>
-        <w:rPr>
-          <w:rFonts w:ascii="Sakkal Majalla" w:hAnsi="Sakkal Majalla" w:cs="Sakkal Majalla"/>
-          <w:color w:val="000000"/>
-          <w:sz w:val="30"/>
-          <w:szCs w:val="30"/>
-          <w:rtl/>
-        </w:rPr>
-        <w:t xml:space="preserve">11.6  المكوّن الثامن: الأثر والمساءلة، وإغلاق الحلقة</w:t>
-      </w:r>
-    </w:p>
-    <w:p>
-      <w:pPr>
-        <w:bidi/>
-        <w:rPr>
-          <w:rFonts w:ascii="Sakkal Majalla" w:hAnsi="Sakkal Majalla" w:cs="Sakkal Majalla"/>
-        </w:rPr>
-      </w:pPr>
-      <w:r>
-        <w:rPr>
-          <w:rFonts w:ascii="Sakkal Majalla" w:hAnsi="Sakkal Majalla" w:cs="Sakkal Majalla"/>
-          <w:color w:val="000000"/>
-          <w:sz w:val="30"/>
-          <w:szCs w:val="30"/>
-          <w:rtl/>
-        </w:rPr>
-        <w:t xml:space="preserve">11.7  السلسلة مجمَّعة: المخطط الكامل وتطبيقه على حالة مؤسسية</w:t>
-      </w:r>
-    </w:p>
-    <w:p>
-      <w:pPr>
-        <w:bidi/>
-        <w:rPr>
-          <w:rFonts w:ascii="Sakkal Majalla" w:hAnsi="Sakkal Majalla" w:cs="Sakkal Majalla"/>
-        </w:rPr>
-      </w:pPr>
-      <w:r>
-        <w:rPr>
-          <w:rFonts w:ascii="Sakkal Majalla" w:hAnsi="Sakkal Majalla" w:cs="Sakkal Majalla"/>
-          <w:color w:val="000000"/>
-          <w:sz w:val="30"/>
-          <w:szCs w:val="30"/>
-          <w:rtl/>
-        </w:rPr>
-        <w:t xml:space="preserve">11.8  مثال توضيحي ثانٍ: مستشفى يخصص أسرّة عناية مركزة محدودة</w:t>
-      </w:r>
-    </w:p>
-    <w:p>
-      <w:pPr>
-        <w:bidi/>
-        <w:rPr>
-          <w:rFonts w:ascii="Sakkal Majalla" w:hAnsi="Sakkal Majalla" w:cs="Sakkal Majalla"/>
-        </w:rPr>
-      </w:pPr>
-      <w:r>
-        <w:rPr>
-          <w:rFonts w:ascii="Sakkal Majalla" w:hAnsi="Sakkal Majalla" w:cs="Sakkal Majalla"/>
-          <w:color w:val="000000"/>
-          <w:sz w:val="30"/>
-          <w:szCs w:val="30"/>
-          <w:rtl/>
-        </w:rPr>
-        <w:t xml:space="preserve">11.9  مقارنة معمَّقة: QMF والأطر البنائية الغربية الأربعة</w:t>
-      </w:r>
-    </w:p>
-    <w:p>
-      <w:pPr>
-        <w:bidi/>
-        <w:rPr>
-          <w:rFonts w:ascii="Sakkal Majalla" w:hAnsi="Sakkal Majalla" w:cs="Sakkal Majalla"/>
-        </w:rPr>
-      </w:pPr>
-      <w:r>
-        <w:rPr>
-          <w:rFonts w:ascii="Sakkal Majalla" w:hAnsi="Sakkal Majalla" w:cs="Sakkal Majalla"/>
-          <w:color w:val="000000"/>
-          <w:sz w:val="30"/>
-          <w:szCs w:val="30"/>
-          <w:rtl/>
-        </w:rPr>
-        <w:t xml:space="preserve">11.10  اختبار اتساق ذاتي: مستويات الادعاء عبر المكوّنات الثمانية</w:t>
-      </w:r>
-    </w:p>
-    <w:p>
-      <w:pPr>
-        <w:bidi/>
-        <w:rPr>
-          <w:rFonts w:ascii="Sakkal Majalla" w:hAnsi="Sakkal Majalla" w:cs="Sakkal Majalla"/>
-        </w:rPr>
-      </w:pPr>
-      <w:r>
-        <w:rPr>
-          <w:rFonts w:ascii="Sakkal Majalla" w:hAnsi="Sakkal Majalla" w:cs="Sakkal Majalla"/>
-          <w:color w:val="000000"/>
-          <w:sz w:val="30"/>
-          <w:szCs w:val="30"/>
-          <w:rtl/>
-        </w:rPr>
-        <w:t xml:space="preserve">11.11  تتبع مكوّن الغاية عبر السلم السباعي</w:t>
-      </w:r>
-    </w:p>
-    <w:p>
-      <w:pPr>
-        <w:bidi/>
-        <w:rPr>
-          <w:rFonts w:ascii="Sakkal Majalla" w:hAnsi="Sakkal Majalla" w:cs="Sakkal Majalla"/>
-        </w:rPr>
-      </w:pPr>
-      <w:r>
-        <w:rPr>
-          <w:rFonts w:ascii="Sakkal Majalla" w:hAnsi="Sakkal Majalla" w:cs="Sakkal Majalla"/>
-          <w:color w:val="000000"/>
-          <w:sz w:val="30"/>
-          <w:szCs w:val="30"/>
-          <w:rtl/>
-        </w:rPr>
-        <w:t xml:space="preserve">11.12  خمسة اعتراضات على إطار QMF</w:t>
-      </w:r>
-    </w:p>
-    <w:p>
-      <w:pPr>
-        <w:bidi/>
-        <w:rPr>
-          <w:rFonts w:ascii="Sakkal Majalla" w:hAnsi="Sakkal Majalla" w:cs="Sakkal Majalla"/>
-        </w:rPr>
-      </w:pPr>
-      <w:r>
-        <w:rPr>
-          <w:rFonts w:ascii="Sakkal Majalla" w:hAnsi="Sakkal Majalla" w:cs="Sakkal Majalla"/>
-          <w:color w:val="000000"/>
-          <w:sz w:val="30"/>
-          <w:szCs w:val="30"/>
-          <w:rtl/>
-        </w:rPr>
-        <w:t xml:space="preserve">11.13  حدود الادعاء: ما يثبته هذا الفصل وما لا يثبته</w:t>
-      </w:r>
-    </w:p>
-    <w:p>
-      <w:pPr>
-        <w:bidi/>
-        <w:rPr>
-          <w:rFonts w:ascii="Sakkal Majalla" w:hAnsi="Sakkal Majalla" w:cs="Sakkal Majalla"/>
-        </w:rPr>
-      </w:pPr>
-      <w:r>
-        <w:rPr>
-          <w:rFonts w:ascii="Sakkal Majalla" w:hAnsi="Sakkal Majalla" w:cs="Sakkal Majalla"/>
-          <w:color w:val="000000"/>
-          <w:sz w:val="30"/>
-          <w:szCs w:val="30"/>
-          <w:rtl/>
-        </w:rPr>
-        <w:t xml:space="preserve">11.14  قائمة المراجع المذكورة في هذا الفصل</w:t>
-      </w:r>
-    </w:p>
-    <w:p>
-      <w:pPr>
-        <w:bidi/>
-        <w:rPr>
-          <w:rFonts w:ascii="Sakkal Majalla" w:hAnsi="Sakkal Majalla" w:cs="Sakkal Majalla"/>
-        </w:rPr>
-      </w:pPr>
-      <w:r>
-        <w:rPr>
-          <w:rFonts w:ascii="Sakkal Majalla" w:hAnsi="Sakkal Majalla" w:cs="Sakkal Majalla"/>
-          <w:b/>
-          <w:bCs/>
-          <w:color w:val="156082"/>
-          <w:sz w:val="30"/>
-          <w:szCs w:val="30"/>
-          <w:rtl/>
-        </w:rPr>
-        <w:t xml:space="preserve">الفصل الثاني عشر: آلية عمل المنظومة، نموذج الفعل الإداري القرآني، الدورة السباعية من الاستشعار إلى المتابعة والمحاسبة</w:t>
-      </w:r>
-    </w:p>
-    <w:p>
-      <w:pPr>
-        <w:bidi/>
-        <w:rPr>
-          <w:rFonts w:ascii="Sakkal Majalla" w:hAnsi="Sakkal Majalla" w:cs="Sakkal Majalla"/>
-        </w:rPr>
-      </w:pPr>
-      <w:r>
-        <w:rPr>
-          <w:rFonts w:ascii="Sakkal Majalla" w:hAnsi="Sakkal Majalla" w:cs="Sakkal Majalla"/>
-          <w:color w:val="000000"/>
-          <w:sz w:val="30"/>
-          <w:szCs w:val="30"/>
-          <w:rtl/>
-        </w:rPr>
-        <w:t xml:space="preserve">12.1  لماذا فصل حركي الآن؟ وأربعة نماذج غربية للقرار</w:t>
-      </w:r>
-    </w:p>
-    <w:p>
-      <w:pPr>
-        <w:bidi/>
-        <w:rPr>
-          <w:rFonts w:ascii="Sakkal Majalla" w:hAnsi="Sakkal Majalla" w:cs="Sakkal Majalla"/>
-        </w:rPr>
-      </w:pPr>
-      <w:r>
-        <w:rPr>
-          <w:rFonts w:ascii="Sakkal Majalla" w:hAnsi="Sakkal Majalla" w:cs="Sakkal Majalla"/>
-          <w:color w:val="000000"/>
-          <w:sz w:val="30"/>
-          <w:szCs w:val="30"/>
-          <w:rtl/>
-        </w:rPr>
-        <w:t xml:space="preserve">12.2  الدورة السباعية: تعريف كل مرحلة ومصدرها</w:t>
-      </w:r>
-    </w:p>
-    <w:p>
-      <w:pPr>
-        <w:bidi/>
-        <w:rPr>
-          <w:rFonts w:ascii="Sakkal Majalla" w:hAnsi="Sakkal Majalla" w:cs="Sakkal Majalla"/>
-        </w:rPr>
-      </w:pPr>
-      <w:r>
-        <w:rPr>
-          <w:rFonts w:ascii="Sakkal Majalla" w:hAnsi="Sakkal Majalla" w:cs="Sakkal Majalla"/>
-          <w:color w:val="000000"/>
-          <w:sz w:val="30"/>
-          <w:szCs w:val="30"/>
-          <w:rtl/>
-        </w:rPr>
-        <w:t xml:space="preserve">12.3  المرحلة الأولى: الاستشعار، نقطة تفعيل الدورة</w:t>
-      </w:r>
-    </w:p>
-    <w:p>
-      <w:pPr>
-        <w:bidi/>
-        <w:rPr>
-          <w:rFonts w:ascii="Sakkal Majalla" w:hAnsi="Sakkal Majalla" w:cs="Sakkal Majalla"/>
-        </w:rPr>
-      </w:pPr>
-      <w:r>
-        <w:rPr>
-          <w:rFonts w:ascii="Sakkal Majalla" w:hAnsi="Sakkal Majalla" w:cs="Sakkal Majalla"/>
-          <w:color w:val="000000"/>
-          <w:sz w:val="30"/>
-          <w:szCs w:val="30"/>
-          <w:rtl/>
-        </w:rPr>
-        <w:t xml:space="preserve">12.4  المرحلة الخامسة: العزم، من إشارة موجزة إلى علامات إجرائية</w:t>
-      </w:r>
-    </w:p>
-    <w:p>
-      <w:pPr>
-        <w:bidi/>
-        <w:rPr>
-          <w:rFonts w:ascii="Sakkal Majalla" w:hAnsi="Sakkal Majalla" w:cs="Sakkal Majalla"/>
-        </w:rPr>
-      </w:pPr>
-      <w:r>
-        <w:rPr>
-          <w:rFonts w:ascii="Sakkal Majalla" w:hAnsi="Sakkal Majalla" w:cs="Sakkal Majalla"/>
-          <w:color w:val="000000"/>
-          <w:sz w:val="30"/>
-          <w:szCs w:val="30"/>
-          <w:rtl/>
-        </w:rPr>
-        <w:t xml:space="preserve">12.5  المرحلة السادسة: التوكل والتنفيذ، من الثبات النفسي إلى الانضباط التنفيذي</w:t>
-      </w:r>
-    </w:p>
-    <w:p>
-      <w:pPr>
-        <w:bidi/>
-        <w:rPr>
-          <w:rFonts w:ascii="Sakkal Majalla" w:hAnsi="Sakkal Majalla" w:cs="Sakkal Majalla"/>
-        </w:rPr>
-      </w:pPr>
-      <w:r>
-        <w:rPr>
-          <w:rFonts w:ascii="Sakkal Majalla" w:hAnsi="Sakkal Majalla" w:cs="Sakkal Majalla"/>
-          <w:color w:val="000000"/>
-          <w:sz w:val="30"/>
-          <w:szCs w:val="30"/>
-          <w:rtl/>
-        </w:rPr>
-        <w:t xml:space="preserve">12.6  المرحلة السابعة: المتابعة والمحاسبة، وإغلاق الحلقة</w:t>
-      </w:r>
-    </w:p>
-    <w:p>
-      <w:pPr>
-        <w:bidi/>
-        <w:rPr>
-          <w:rFonts w:ascii="Sakkal Majalla" w:hAnsi="Sakkal Majalla" w:cs="Sakkal Majalla"/>
-        </w:rPr>
-      </w:pPr>
-      <w:r>
-        <w:rPr>
-          <w:rFonts w:ascii="Sakkal Majalla" w:hAnsi="Sakkal Majalla" w:cs="Sakkal Majalla"/>
-          <w:color w:val="000000"/>
-          <w:sz w:val="30"/>
-          <w:szCs w:val="30"/>
-          <w:rtl/>
-        </w:rPr>
-        <w:t xml:space="preserve">12.7  الدورة مجمَّعة: المخطط وتطبيقه على حالتين</w:t>
-      </w:r>
-    </w:p>
-    <w:p>
-      <w:pPr>
-        <w:bidi/>
-        <w:rPr>
-          <w:rFonts w:ascii="Sakkal Majalla" w:hAnsi="Sakkal Majalla" w:cs="Sakkal Majalla"/>
-        </w:rPr>
-      </w:pPr>
-      <w:r>
-        <w:rPr>
-          <w:rFonts w:ascii="Sakkal Majalla" w:hAnsi="Sakkal Majalla" w:cs="Sakkal Majalla"/>
-          <w:color w:val="000000"/>
-          <w:sz w:val="30"/>
-          <w:szCs w:val="30"/>
-          <w:rtl/>
-        </w:rPr>
-        <w:t xml:space="preserve">12.8  مقارنة معمَّقة: الدورة السباعية ونماذج القرار الغربية الأربعة</w:t>
-      </w:r>
-    </w:p>
-    <w:p>
-      <w:pPr>
-        <w:bidi/>
-        <w:rPr>
-          <w:rFonts w:ascii="Sakkal Majalla" w:hAnsi="Sakkal Majalla" w:cs="Sakkal Majalla"/>
-        </w:rPr>
-      </w:pPr>
-      <w:r>
-        <w:rPr>
-          <w:rFonts w:ascii="Sakkal Majalla" w:hAnsi="Sakkal Majalla" w:cs="Sakkal Majalla"/>
-          <w:color w:val="000000"/>
-          <w:sz w:val="30"/>
-          <w:szCs w:val="30"/>
-          <w:rtl/>
-        </w:rPr>
-        <w:t xml:space="preserve">12.9  تتبع مرحلة الاستشعار عبر السلم السباعي</w:t>
-      </w:r>
-    </w:p>
-    <w:p>
-      <w:pPr>
-        <w:bidi/>
-        <w:rPr>
-          <w:rFonts w:ascii="Sakkal Majalla" w:hAnsi="Sakkal Majalla" w:cs="Sakkal Majalla"/>
-        </w:rPr>
-      </w:pPr>
-      <w:r>
-        <w:rPr>
-          <w:rFonts w:ascii="Sakkal Majalla" w:hAnsi="Sakkal Majalla" w:cs="Sakkal Majalla"/>
-          <w:color w:val="000000"/>
-          <w:sz w:val="30"/>
-          <w:szCs w:val="30"/>
-          <w:rtl/>
-        </w:rPr>
-        <w:t xml:space="preserve">12.10  خمسة اعتراضات على الدورة السباعية</w:t>
-      </w:r>
-    </w:p>
-    <w:p>
-      <w:pPr>
-        <w:bidi/>
-        <w:rPr>
-          <w:rFonts w:ascii="Sakkal Majalla" w:hAnsi="Sakkal Majalla" w:cs="Sakkal Majalla"/>
-        </w:rPr>
-      </w:pPr>
-      <w:r>
-        <w:rPr>
-          <w:rFonts w:ascii="Sakkal Majalla" w:hAnsi="Sakkal Majalla" w:cs="Sakkal Majalla"/>
-          <w:color w:val="000000"/>
-          <w:sz w:val="30"/>
-          <w:szCs w:val="30"/>
-          <w:rtl/>
-        </w:rPr>
-        <w:t xml:space="preserve">12.11  حدود الادعاء: ما يثبته هذا الفصل وما لا يثبته</w:t>
-      </w:r>
-    </w:p>
-    <w:p>
-      <w:pPr>
-        <w:bidi/>
-        <w:rPr>
-          <w:rFonts w:ascii="Sakkal Majalla" w:hAnsi="Sakkal Majalla" w:cs="Sakkal Majalla"/>
-        </w:rPr>
-      </w:pPr>
-      <w:r>
-        <w:rPr>
-          <w:rFonts w:ascii="Sakkal Majalla" w:hAnsi="Sakkal Majalla" w:cs="Sakkal Majalla"/>
-          <w:color w:val="000000"/>
-          <w:sz w:val="30"/>
-          <w:szCs w:val="30"/>
-          <w:rtl/>
-        </w:rPr>
-        <w:t xml:space="preserve">12.12  قائمة المراجع المذكورة في هذا الفصل</w:t>
-      </w:r>
-    </w:p>
-    <w:p>
-      <w:pPr>
-        <w:bidi/>
-        <w:rPr>
-          <w:rFonts w:ascii="Sakkal Majalla" w:hAnsi="Sakkal Majalla" w:cs="Sakkal Majalla"/>
-        </w:rPr>
-      </w:pPr>
-      <w:r>
-        <w:rPr>
-          <w:rFonts w:ascii="Sakkal Majalla" w:hAnsi="Sakkal Majalla" w:cs="Sakkal Majalla"/>
-          <w:b/>
-          <w:bCs/>
-          <w:color w:val="156082"/>
-          <w:sz w:val="30"/>
-          <w:szCs w:val="30"/>
-          <w:rtl/>
-        </w:rPr>
-        <w:t xml:space="preserve">الفصل الثالث عشر: معايير اختبار المنظومة وتطويرها، ما الذي يُبقيها قرآنيةً بعد التجربة؟</w:t>
-      </w:r>
-    </w:p>
-    <w:p>
-      <w:pPr>
-        <w:bidi/>
-        <w:rPr>
-          <w:rFonts w:ascii="Sakkal Majalla" w:hAnsi="Sakkal Majalla" w:cs="Sakkal Majalla"/>
-        </w:rPr>
-      </w:pPr>
-      <w:r>
-        <w:rPr>
-          <w:rFonts w:ascii="Sakkal Majalla" w:hAnsi="Sakkal Majalla" w:cs="Sakkal Majalla"/>
-          <w:color w:val="000000"/>
-          <w:sz w:val="30"/>
-          <w:szCs w:val="30"/>
-          <w:rtl/>
-        </w:rPr>
-        <w:t xml:space="preserve">13.1  لماذا فصل للضبط الآن؟ وأربعة أطر غربية للتحقق والجودة</w:t>
-      </w:r>
-    </w:p>
-    <w:p>
-      <w:pPr>
-        <w:bidi/>
-        <w:rPr>
-          <w:rFonts w:ascii="Sakkal Majalla" w:hAnsi="Sakkal Majalla" w:cs="Sakkal Majalla"/>
-        </w:rPr>
-      </w:pPr>
-      <w:r>
-        <w:rPr>
-          <w:rFonts w:ascii="Sakkal Majalla" w:hAnsi="Sakkal Majalla" w:cs="Sakkal Majalla"/>
-          <w:color w:val="000000"/>
-          <w:sz w:val="30"/>
-          <w:szCs w:val="30"/>
-          <w:rtl/>
-        </w:rPr>
-        <w:t xml:space="preserve">13.2  المعايير التسعة: تعريف كل معيار ومصدره</w:t>
-      </w:r>
-    </w:p>
-    <w:p>
-      <w:pPr>
-        <w:bidi/>
-        <w:rPr>
-          <w:rFonts w:ascii="Sakkal Majalla" w:hAnsi="Sakkal Majalla" w:cs="Sakkal Majalla"/>
-        </w:rPr>
-      </w:pPr>
-      <w:r>
-        <w:rPr>
-          <w:rFonts w:ascii="Sakkal Majalla" w:hAnsi="Sakkal Majalla" w:cs="Sakkal Majalla"/>
-          <w:color w:val="000000"/>
-          <w:sz w:val="30"/>
-          <w:szCs w:val="30"/>
-          <w:rtl/>
-        </w:rPr>
-        <w:t xml:space="preserve">13.3  المعياران الثامن والتاسع: الشفافية المنهجية والقابلية للمراجعة</w:t>
-      </w:r>
-    </w:p>
-    <w:p>
-      <w:pPr>
-        <w:bidi/>
-        <w:rPr>
-          <w:rFonts w:ascii="Sakkal Majalla" w:hAnsi="Sakkal Majalla" w:cs="Sakkal Majalla"/>
-        </w:rPr>
-      </w:pPr>
-      <w:r>
-        <w:rPr>
-          <w:rFonts w:ascii="Sakkal Majalla" w:hAnsi="Sakkal Majalla" w:cs="Sakkal Majalla"/>
-          <w:color w:val="000000"/>
-          <w:sz w:val="30"/>
-          <w:szCs w:val="30"/>
-          <w:rtl/>
-        </w:rPr>
-        <w:t xml:space="preserve">13.4  ثلاث حالات للعلاقة مع الأدبيات الإدارية: توافق، واستقلال، وتعارض</w:t>
-      </w:r>
-    </w:p>
-    <w:p>
-      <w:pPr>
-        <w:bidi/>
-        <w:rPr>
-          <w:rFonts w:ascii="Sakkal Majalla" w:hAnsi="Sakkal Majalla" w:cs="Sakkal Majalla"/>
-        </w:rPr>
-      </w:pPr>
-      <w:r>
-        <w:rPr>
-          <w:rFonts w:ascii="Sakkal Majalla" w:hAnsi="Sakkal Majalla" w:cs="Sakkal Majalla"/>
-          <w:color w:val="000000"/>
-          <w:sz w:val="30"/>
-          <w:szCs w:val="30"/>
-          <w:rtl/>
-        </w:rPr>
-        <w:t xml:space="preserve">13.5  قاعدة الكتاب: فشل التطبيق يُراجَع فيه النموذج البشري لا النص القرآني</w:t>
-      </w:r>
-    </w:p>
-    <w:p>
-      <w:pPr>
-        <w:bidi/>
-        <w:rPr>
-          <w:rFonts w:ascii="Sakkal Majalla" w:hAnsi="Sakkal Majalla" w:cs="Sakkal Majalla"/>
-        </w:rPr>
-      </w:pPr>
-      <w:r>
-        <w:rPr>
-          <w:rFonts w:ascii="Sakkal Majalla" w:hAnsi="Sakkal Majalla" w:cs="Sakkal Majalla"/>
-          <w:color w:val="000000"/>
-          <w:sz w:val="30"/>
-          <w:szCs w:val="30"/>
-          <w:rtl/>
-        </w:rPr>
-        <w:t xml:space="preserve">13.6  دور الدراسات الكمية والنوعية في اختبار المبادئ</w:t>
-      </w:r>
-    </w:p>
-    <w:p>
-      <w:pPr>
-        <w:bidi/>
-        <w:rPr>
-          <w:rFonts w:ascii="Sakkal Majalla" w:hAnsi="Sakkal Majalla" w:cs="Sakkal Majalla"/>
-        </w:rPr>
-      </w:pPr>
-      <w:r>
-        <w:rPr>
-          <w:rFonts w:ascii="Sakkal Majalla" w:hAnsi="Sakkal Majalla" w:cs="Sakkal Majalla"/>
-          <w:color w:val="000000"/>
-          <w:sz w:val="30"/>
-          <w:szCs w:val="30"/>
-          <w:rtl/>
-        </w:rPr>
-        <w:t xml:space="preserve">13.7  تطبيقان: اختبار نموذجين مقترحين بالمعايير التسعة</w:t>
-      </w:r>
-    </w:p>
-    <w:p>
-      <w:pPr>
-        <w:bidi/>
-        <w:rPr>
-          <w:rFonts w:ascii="Sakkal Majalla" w:hAnsi="Sakkal Majalla" w:cs="Sakkal Majalla"/>
-        </w:rPr>
-      </w:pPr>
-      <w:r>
-        <w:rPr>
-          <w:rFonts w:ascii="Sakkal Majalla" w:hAnsi="Sakkal Majalla" w:cs="Sakkal Majalla"/>
-          <w:color w:val="000000"/>
-          <w:sz w:val="30"/>
-          <w:szCs w:val="30"/>
-          <w:rtl/>
-        </w:rPr>
-        <w:t xml:space="preserve">13.8  مقارنة معمَّقة: المعايير التسعة وأطر التحقق والجودة الغربية الأربعة</w:t>
-      </w:r>
-    </w:p>
-    <w:p>
-      <w:pPr>
-        <w:bidi/>
-        <w:rPr>
-          <w:rFonts w:ascii="Sakkal Majalla" w:hAnsi="Sakkal Majalla" w:cs="Sakkal Majalla"/>
-        </w:rPr>
-      </w:pPr>
-      <w:r>
-        <w:rPr>
-          <w:rFonts w:ascii="Sakkal Majalla" w:hAnsi="Sakkal Majalla" w:cs="Sakkal Majalla"/>
-          <w:color w:val="000000"/>
-          <w:sz w:val="30"/>
-          <w:szCs w:val="30"/>
-          <w:rtl/>
-        </w:rPr>
-        <w:t xml:space="preserve">13.9  اختبار اتساق ذاتي: تطبيق المعايير التسعة على نفسها</w:t>
-      </w:r>
-    </w:p>
-    <w:p>
-      <w:pPr>
-        <w:bidi/>
-        <w:rPr>
-          <w:rFonts w:ascii="Sakkal Majalla" w:hAnsi="Sakkal Majalla" w:cs="Sakkal Majalla"/>
-        </w:rPr>
-      </w:pPr>
-      <w:r>
-        <w:rPr>
-          <w:rFonts w:ascii="Sakkal Majalla" w:hAnsi="Sakkal Majalla" w:cs="Sakkal Majalla"/>
-          <w:color w:val="000000"/>
-          <w:sz w:val="30"/>
-          <w:szCs w:val="30"/>
-          <w:rtl/>
-        </w:rPr>
-        <w:t xml:space="preserve">13.10  خمسة اعتراضات على منظومة المعايير</w:t>
-      </w:r>
-    </w:p>
-    <w:p>
-      <w:pPr>
-        <w:bidi/>
-        <w:rPr>
-          <w:rFonts w:ascii="Sakkal Majalla" w:hAnsi="Sakkal Majalla" w:cs="Sakkal Majalla"/>
-        </w:rPr>
-      </w:pPr>
-      <w:r>
-        <w:rPr>
-          <w:rFonts w:ascii="Sakkal Majalla" w:hAnsi="Sakkal Majalla" w:cs="Sakkal Majalla"/>
-          <w:color w:val="000000"/>
-          <w:sz w:val="30"/>
-          <w:szCs w:val="30"/>
-          <w:rtl/>
-        </w:rPr>
-        <w:t xml:space="preserve">13.11  حدود الادعاء: ما يثبته هذا الفصل وما لا يثبته</w:t>
-      </w:r>
-    </w:p>
-    <w:p>
-      <w:pPr>
-        <w:bidi/>
-        <w:rPr>
-          <w:rFonts w:ascii="Sakkal Majalla" w:hAnsi="Sakkal Majalla" w:cs="Sakkal Majalla"/>
-        </w:rPr>
-      </w:pPr>
-      <w:r>
-        <w:rPr>
-          <w:rFonts w:ascii="Sakkal Majalla" w:hAnsi="Sakkal Majalla" w:cs="Sakkal Majalla"/>
-          <w:color w:val="000000"/>
-          <w:sz w:val="30"/>
-          <w:szCs w:val="30"/>
-          <w:rtl/>
-        </w:rPr>
-        <w:t xml:space="preserve">13.12  قائمة المراجع المذكورة في هذا الفصل</w:t>
-      </w:r>
-    </w:p>
-    <w:p>
-      <w:pPr>
-        <w:bidi/>
-        <w:rPr>
-          <w:rFonts w:ascii="Sakkal Majalla" w:hAnsi="Sakkal Majalla" w:cs="Sakkal Majalla"/>
-        </w:rPr>
-      </w:pPr>
-      <w:r>
-        <w:rPr>
-          <w:rFonts w:ascii="Sakkal Majalla" w:hAnsi="Sakkal Majalla" w:cs="Sakkal Majalla"/>
-          <w:b/>
-          <w:bCs/>
-          <w:color w:val="156082"/>
-          <w:sz w:val="30"/>
-          <w:szCs w:val="30"/>
-          <w:rtl/>
-        </w:rPr>
-        <w:t xml:space="preserve">الفصل الرابع عشر: حالات تطبيقية موسَّعة: القطاع الخاص وميادين الحياة، ثمانية ميادين، وجهاز منهجي واحد</w:t>
-      </w:r>
-    </w:p>
-    <w:p>
-      <w:pPr>
-        <w:bidi/>
-        <w:rPr>
-          <w:rFonts w:ascii="Sakkal Majalla" w:hAnsi="Sakkal Majalla" w:cs="Sakkal Majalla"/>
-        </w:rPr>
-      </w:pPr>
-      <w:r>
-        <w:rPr>
-          <w:rFonts w:ascii="Sakkal Majalla" w:hAnsi="Sakkal Majalla" w:cs="Sakkal Majalla"/>
-          <w:color w:val="000000"/>
-          <w:sz w:val="30"/>
-          <w:szCs w:val="30"/>
-          <w:rtl/>
-        </w:rPr>
-        <w:t xml:space="preserve">14.1  لماذا حالات مركبة الآن؟ وأربعة أطر غربية لتحليل الحالة</w:t>
-      </w:r>
-    </w:p>
-    <w:p>
-      <w:pPr>
-        <w:bidi/>
-        <w:rPr>
-          <w:rFonts w:ascii="Sakkal Majalla" w:hAnsi="Sakkal Majalla" w:cs="Sakkal Majalla"/>
-        </w:rPr>
-      </w:pPr>
-      <w:r>
-        <w:rPr>
-          <w:rFonts w:ascii="Sakkal Majalla" w:hAnsi="Sakkal Majalla" w:cs="Sakkal Majalla"/>
-          <w:color w:val="000000"/>
-          <w:sz w:val="30"/>
-          <w:szCs w:val="30"/>
-          <w:rtl/>
-        </w:rPr>
-        <w:t xml:space="preserve">14.2  الحالة الأولى: مصانع النور للصناعات الغذائية، السلامة العمالية وضغط الإنتاج</w:t>
-      </w:r>
-    </w:p>
-    <w:p>
-      <w:pPr>
-        <w:bidi/>
-        <w:rPr>
-          <w:rFonts w:ascii="Sakkal Majalla" w:hAnsi="Sakkal Majalla" w:cs="Sakkal Majalla"/>
-        </w:rPr>
-      </w:pPr>
-      <w:r>
-        <w:rPr>
-          <w:rFonts w:ascii="Sakkal Majalla" w:hAnsi="Sakkal Majalla" w:cs="Sakkal Majalla"/>
-          <w:color w:val="000000"/>
-          <w:sz w:val="30"/>
-          <w:szCs w:val="30"/>
-          <w:rtl/>
-        </w:rPr>
-        <w:t xml:space="preserve">14.3  الحالة الثانية: بيت المشورة للاستشارات المالية، معضلة أخلاقية تنظيمية مركبة</w:t>
-      </w:r>
-    </w:p>
-    <w:p>
-      <w:pPr>
-        <w:bidi/>
-        <w:rPr>
-          <w:rFonts w:ascii="Sakkal Majalla" w:hAnsi="Sakkal Majalla" w:cs="Sakkal Majalla"/>
-        </w:rPr>
-      </w:pPr>
-      <w:r>
-        <w:rPr>
-          <w:rFonts w:ascii="Sakkal Majalla" w:hAnsi="Sakkal Majalla" w:cs="Sakkal Majalla"/>
-          <w:color w:val="000000"/>
-          <w:sz w:val="30"/>
-          <w:szCs w:val="30"/>
-          <w:rtl/>
-        </w:rPr>
-        <w:t xml:space="preserve">14.4  الحالة الثالثة: سوق الخير، منصة تجارة إلكترونية في حرب أسعار</w:t>
-      </w:r>
-    </w:p>
-    <w:p>
-      <w:pPr>
-        <w:bidi/>
-        <w:rPr>
-          <w:rFonts w:ascii="Sakkal Majalla" w:hAnsi="Sakkal Majalla" w:cs="Sakkal Majalla"/>
-        </w:rPr>
-      </w:pPr>
-      <w:r>
-        <w:rPr>
-          <w:rFonts w:ascii="Sakkal Majalla" w:hAnsi="Sakkal Majalla" w:cs="Sakkal Majalla"/>
-          <w:color w:val="000000"/>
-          <w:sz w:val="30"/>
-          <w:szCs w:val="30"/>
-          <w:rtl/>
-        </w:rPr>
-        <w:t xml:space="preserve">14.5  الحالة الرابعة: مجموعة الوفاء التجارية، توسع يهدد قيم التأسيس</w:t>
-      </w:r>
-    </w:p>
-    <w:p>
-      <w:pPr>
-        <w:bidi/>
-        <w:rPr>
-          <w:rFonts w:ascii="Sakkal Majalla" w:hAnsi="Sakkal Majalla" w:cs="Sakkal Majalla"/>
-        </w:rPr>
-      </w:pPr>
-      <w:r>
-        <w:rPr>
-          <w:rFonts w:ascii="Sakkal Majalla" w:hAnsi="Sakkal Majalla" w:cs="Sakkal Majalla"/>
-          <w:color w:val="000000"/>
-          <w:sz w:val="30"/>
-          <w:szCs w:val="30"/>
-          <w:rtl/>
-        </w:rPr>
-        <w:t xml:space="preserve">14.6  الحالة الخامسة: أحمد، إدارة الحياة الشخصية والتوازن</w:t>
-      </w:r>
-    </w:p>
-    <w:p>
-      <w:pPr>
-        <w:bidi/>
-        <w:rPr>
-          <w:rFonts w:ascii="Sakkal Majalla" w:hAnsi="Sakkal Majalla" w:cs="Sakkal Majalla"/>
-        </w:rPr>
-      </w:pPr>
-      <w:r>
-        <w:rPr>
-          <w:rFonts w:ascii="Sakkal Majalla" w:hAnsi="Sakkal Majalla" w:cs="Sakkal Majalla"/>
-          <w:color w:val="000000"/>
-          <w:sz w:val="30"/>
-          <w:szCs w:val="30"/>
-          <w:rtl/>
-        </w:rPr>
-        <w:t xml:space="preserve">14.7  الحالة السادسة: سارة، قرار مصيري تحت ضغط الوقت</w:t>
-      </w:r>
-    </w:p>
-    <w:p>
-      <w:pPr>
-        <w:bidi/>
-        <w:rPr>
-          <w:rFonts w:ascii="Sakkal Majalla" w:hAnsi="Sakkal Majalla" w:cs="Sakkal Majalla"/>
-        </w:rPr>
-      </w:pPr>
-      <w:r>
-        <w:rPr>
-          <w:rFonts w:ascii="Sakkal Majalla" w:hAnsi="Sakkal Majalla" w:cs="Sakkal Majalla"/>
-          <w:color w:val="000000"/>
-          <w:sz w:val="30"/>
-          <w:szCs w:val="30"/>
-          <w:rtl/>
-        </w:rPr>
-        <w:t xml:space="preserve">14.8  الحالة السابعة: منصور، الخروج من شراكة في عمل خاص</w:t>
-      </w:r>
-    </w:p>
-    <w:p>
-      <w:pPr>
-        <w:bidi/>
-        <w:rPr>
-          <w:rFonts w:ascii="Sakkal Majalla" w:hAnsi="Sakkal Majalla" w:cs="Sakkal Majalla"/>
-        </w:rPr>
-      </w:pPr>
-      <w:r>
-        <w:rPr>
-          <w:rFonts w:ascii="Sakkal Majalla" w:hAnsi="Sakkal Majalla" w:cs="Sakkal Majalla"/>
-          <w:color w:val="000000"/>
-          <w:sz w:val="30"/>
-          <w:szCs w:val="30"/>
-          <w:rtl/>
-        </w:rPr>
-        <w:t xml:space="preserve">14.9  الحالة الثامنة: خالد، أزمة مشروع في محفظة متوازية</w:t>
-      </w:r>
-    </w:p>
-    <w:p>
-      <w:pPr>
-        <w:bidi/>
-        <w:rPr>
-          <w:rFonts w:ascii="Sakkal Majalla" w:hAnsi="Sakkal Majalla" w:cs="Sakkal Majalla"/>
-        </w:rPr>
-      </w:pPr>
-      <w:r>
-        <w:rPr>
-          <w:rFonts w:ascii="Sakkal Majalla" w:hAnsi="Sakkal Majalla" w:cs="Sakkal Majalla"/>
-          <w:color w:val="000000"/>
-          <w:sz w:val="30"/>
-          <w:szCs w:val="30"/>
-          <w:rtl/>
-        </w:rPr>
-        <w:t xml:space="preserve">14.10  مقارنة الحالات الثماني: أنماط متكررة وحدودها</w:t>
-      </w:r>
-    </w:p>
-    <w:p>
-      <w:pPr>
-        <w:bidi/>
-        <w:rPr>
-          <w:rFonts w:ascii="Sakkal Majalla" w:hAnsi="Sakkal Majalla" w:cs="Sakkal Majalla"/>
-        </w:rPr>
-      </w:pPr>
-      <w:r>
-        <w:rPr>
-          <w:rFonts w:ascii="Sakkal Majalla" w:hAnsi="Sakkal Majalla" w:cs="Sakkal Majalla"/>
-          <w:color w:val="000000"/>
-          <w:sz w:val="30"/>
-          <w:szCs w:val="30"/>
-          <w:rtl/>
-        </w:rPr>
-        <w:t xml:space="preserve">14.11  مقارنة معمَّقة: الجهاز المنهجي وأطر تحليل الحالة الغربية</w:t>
-      </w:r>
-    </w:p>
-    <w:p>
-      <w:pPr>
-        <w:bidi/>
-        <w:rPr>
-          <w:rFonts w:ascii="Sakkal Majalla" w:hAnsi="Sakkal Majalla" w:cs="Sakkal Majalla"/>
-        </w:rPr>
-      </w:pPr>
-      <w:r>
-        <w:rPr>
-          <w:rFonts w:ascii="Sakkal Majalla" w:hAnsi="Sakkal Majalla" w:cs="Sakkal Majalla"/>
-          <w:color w:val="000000"/>
-          <w:sz w:val="30"/>
-          <w:szCs w:val="30"/>
-          <w:rtl/>
-        </w:rPr>
-        <w:t xml:space="preserve">14.12  أربعة اعتراضات على هذا الفصل</w:t>
-      </w:r>
-    </w:p>
-    <w:p>
-      <w:pPr>
-        <w:bidi/>
-        <w:rPr>
-          <w:rFonts w:ascii="Sakkal Majalla" w:hAnsi="Sakkal Majalla" w:cs="Sakkal Majalla"/>
-        </w:rPr>
-      </w:pPr>
-      <w:r>
-        <w:rPr>
-          <w:rFonts w:ascii="Sakkal Majalla" w:hAnsi="Sakkal Majalla" w:cs="Sakkal Majalla"/>
-          <w:color w:val="000000"/>
-          <w:sz w:val="30"/>
-          <w:szCs w:val="30"/>
-          <w:rtl/>
-        </w:rPr>
-        <w:t xml:space="preserve">14.13  دليل عملي: كيف تطبق الجهاز على معضلتك؟</w:t>
-      </w:r>
-    </w:p>
-    <w:p>
-      <w:pPr>
-        <w:bidi/>
-        <w:rPr>
-          <w:rFonts w:ascii="Sakkal Majalla" w:hAnsi="Sakkal Majalla" w:cs="Sakkal Majalla"/>
-        </w:rPr>
-      </w:pPr>
-      <w:r>
-        <w:rPr>
-          <w:rFonts w:ascii="Sakkal Majalla" w:hAnsi="Sakkal Majalla" w:cs="Sakkal Majalla"/>
-          <w:color w:val="000000"/>
-          <w:sz w:val="30"/>
-          <w:szCs w:val="30"/>
-          <w:rtl/>
-        </w:rPr>
-        <w:t xml:space="preserve">14.14  أجندة بحثية مستخلصة من الحالات</w:t>
-      </w:r>
-    </w:p>
-    <w:p>
-      <w:pPr>
-        <w:bidi/>
-        <w:rPr>
-          <w:rFonts w:ascii="Sakkal Majalla" w:hAnsi="Sakkal Majalla" w:cs="Sakkal Majalla"/>
-        </w:rPr>
-      </w:pPr>
-      <w:r>
-        <w:rPr>
-          <w:rFonts w:ascii="Sakkal Majalla" w:hAnsi="Sakkal Majalla" w:cs="Sakkal Majalla"/>
-          <w:color w:val="000000"/>
-          <w:sz w:val="30"/>
-          <w:szCs w:val="30"/>
-          <w:rtl/>
-        </w:rPr>
-        <w:t xml:space="preserve">14.15  موضع هذه الحالات من أدبيات الإدارة الإسلامية المعاصرة</w:t>
-      </w:r>
-    </w:p>
-    <w:p>
-      <w:pPr>
-        <w:bidi/>
-        <w:rPr>
-          <w:rFonts w:ascii="Sakkal Majalla" w:hAnsi="Sakkal Majalla" w:cs="Sakkal Majalla"/>
-        </w:rPr>
-      </w:pPr>
-      <w:r>
-        <w:rPr>
-          <w:rFonts w:ascii="Sakkal Majalla" w:hAnsi="Sakkal Majalla" w:cs="Sakkal Majalla"/>
-          <w:color w:val="000000"/>
-          <w:sz w:val="30"/>
-          <w:szCs w:val="30"/>
-          <w:rtl/>
-        </w:rPr>
-        <w:t xml:space="preserve">14.16  حدود الادعاء: ما يثبته هذا الفصل وما لا يثبته</w:t>
-      </w:r>
-    </w:p>
-    <w:p>
-      <w:pPr>
-        <w:bidi/>
-        <w:rPr>
-          <w:rFonts w:ascii="Sakkal Majalla" w:hAnsi="Sakkal Majalla" w:cs="Sakkal Majalla"/>
-        </w:rPr>
-      </w:pPr>
-      <w:r>
-        <w:rPr>
-          <w:rFonts w:ascii="Sakkal Majalla" w:hAnsi="Sakkal Majalla" w:cs="Sakkal Majalla"/>
-          <w:color w:val="000000"/>
-          <w:sz w:val="30"/>
-          <w:szCs w:val="30"/>
-          <w:rtl/>
-        </w:rPr>
-        <w:t xml:space="preserve">14.17  قائمة المراجع المذكورة في هذا الفصل</w:t>
-      </w:r>
-    </w:p>
-    <w:p>
-      <w:pPr>
-        <w:bidi/>
-        <w:rPr>
-          <w:rFonts w:ascii="Sakkal Majalla" w:hAnsi="Sakkal Majalla" w:cs="Sakkal Majalla"/>
-        </w:rPr>
-      </w:pPr>
-      <w:r>
-        <w:rPr>
-          <w:rFonts w:ascii="Sakkal Majalla" w:hAnsi="Sakkal Majalla" w:cs="Sakkal Majalla"/>
-          <w:b/>
-          <w:bCs/>
-          <w:color w:val="156082"/>
-          <w:sz w:val="30"/>
-          <w:szCs w:val="30"/>
-          <w:rtl/>
-        </w:rPr>
-        <w:t xml:space="preserve">خاتمة الكتاب الأول: من السؤال إلى المنظومة</w:t>
-      </w:r>
-    </w:p>
-    <w:p>
-      <w:pPr>
-        <w:bidi/>
-        <w:rPr>
-          <w:rFonts w:ascii="Sakkal Majalla" w:hAnsi="Sakkal Majalla" w:cs="Sakkal Majalla"/>
-        </w:rPr>
-      </w:pPr>
-      <w:r>
-        <w:rPr>
-          <w:rFonts w:ascii="Sakkal Majalla" w:hAnsi="Sakkal Majalla" w:cs="Sakkal Majalla"/>
-          <w:color w:val="000000"/>
-          <w:sz w:val="30"/>
-          <w:szCs w:val="30"/>
-          <w:rtl/>
-        </w:rPr>
-        <w:t xml:space="preserve">السؤال الذي بدأنا به</w:t>
-      </w:r>
-    </w:p>
-    <w:p>
-      <w:pPr>
-        <w:bidi/>
-        <w:rPr>
-          <w:rFonts w:ascii="Sakkal Majalla" w:hAnsi="Sakkal Majalla" w:cs="Sakkal Majalla"/>
-        </w:rPr>
-      </w:pPr>
-      <w:r>
-        <w:rPr>
-          <w:rFonts w:ascii="Sakkal Majalla" w:hAnsi="Sakkal Majalla" w:cs="Sakkal Majalla"/>
-          <w:color w:val="000000"/>
-          <w:sz w:val="30"/>
-          <w:szCs w:val="30"/>
-          <w:rtl/>
-        </w:rPr>
-        <w:t xml:space="preserve">الرحلة في أربعة أبواب</w:t>
-      </w:r>
-    </w:p>
-    <w:p>
-      <w:pPr>
-        <w:bidi/>
-        <w:rPr>
-          <w:rFonts w:ascii="Sakkal Majalla" w:hAnsi="Sakkal Majalla" w:cs="Sakkal Majalla"/>
-        </w:rPr>
-      </w:pPr>
-      <w:r>
-        <w:rPr>
-          <w:rFonts w:ascii="Sakkal Majalla" w:hAnsi="Sakkal Majalla" w:cs="Sakkal Majalla"/>
-          <w:color w:val="000000"/>
-          <w:sz w:val="30"/>
-          <w:szCs w:val="30"/>
-          <w:rtl/>
-        </w:rPr>
-        <w:t xml:space="preserve">ما أنجزه الكتاب وما لم ينجزه</w:t>
-      </w:r>
-    </w:p>
-    <w:p>
-      <w:pPr>
-        <w:bidi/>
-        <w:rPr>
-          <w:rFonts w:ascii="Sakkal Majalla" w:hAnsi="Sakkal Majalla" w:cs="Sakkal Majalla"/>
-        </w:rPr>
-      </w:pPr>
-      <w:r>
-        <w:rPr>
-          <w:rFonts w:ascii="Sakkal Majalla" w:hAnsi="Sakkal Majalla" w:cs="Sakkal Majalla"/>
-          <w:color w:val="000000"/>
-          <w:sz w:val="30"/>
-          <w:szCs w:val="30"/>
-          <w:rtl/>
-        </w:rPr>
-        <w:t xml:space="preserve">ما لم يثبته الكتاب</w:t>
-      </w:r>
-    </w:p>
-    <w:p>
-      <w:pPr>
-        <w:bidi/>
-        <w:rPr>
-          <w:rFonts w:ascii="Sakkal Majalla" w:hAnsi="Sakkal Majalla" w:cs="Sakkal Majalla"/>
-        </w:rPr>
-      </w:pPr>
-      <w:r>
-        <w:rPr>
-          <w:rFonts w:ascii="Sakkal Majalla" w:hAnsi="Sakkal Majalla" w:cs="Sakkal Majalla"/>
-          <w:color w:val="000000"/>
-          <w:sz w:val="30"/>
-          <w:szCs w:val="30"/>
-          <w:rtl/>
-        </w:rPr>
-        <w:t xml:space="preserve">ما كان يمكن أن أفعله بطريقة أخرى</w:t>
-      </w:r>
-    </w:p>
-    <w:p>
-      <w:pPr>
-        <w:bidi/>
-        <w:rPr>
-          <w:rFonts w:ascii="Sakkal Majalla" w:hAnsi="Sakkal Majalla" w:cs="Sakkal Majalla"/>
-        </w:rPr>
-      </w:pPr>
-      <w:r>
-        <w:rPr>
-          <w:rFonts w:ascii="Sakkal Majalla" w:hAnsi="Sakkal Majalla" w:cs="Sakkal Majalla"/>
-          <w:color w:val="000000"/>
-          <w:sz w:val="30"/>
-          <w:szCs w:val="30"/>
-          <w:rtl/>
-        </w:rPr>
-        <w:t xml:space="preserve">ما بعد هذا الكتاب</w:t>
-      </w:r>
-    </w:p>
-    <w:p>
-      <w:pPr>
-        <w:bidi/>
-        <w:rPr>
-          <w:rFonts w:ascii="Sakkal Majalla" w:hAnsi="Sakkal Majalla" w:cs="Sakkal Majalla"/>
-        </w:rPr>
-      </w:pPr>
-      <w:r>
-        <w:rPr>
-          <w:rFonts w:ascii="Sakkal Majalla" w:hAnsi="Sakkal Majalla" w:cs="Sakkal Majalla"/>
-          <w:color w:val="000000"/>
-          <w:sz w:val="30"/>
-          <w:szCs w:val="30"/>
-          <w:rtl/>
-        </w:rPr>
-        <w:t xml:space="preserve">كيف يُقرأ الكتاب بحسب القارئ</w:t>
-      </w:r>
-    </w:p>
-    <w:p>
-      <w:pPr>
-        <w:bidi/>
-        <w:rPr>
-          <w:rFonts w:ascii="Sakkal Majalla" w:hAnsi="Sakkal Majalla" w:cs="Sakkal Majalla"/>
-        </w:rPr>
-      </w:pPr>
-      <w:r>
-        <w:rPr>
-          <w:rFonts w:ascii="Sakkal Majalla" w:hAnsi="Sakkal Majalla" w:cs="Sakkal Majalla"/>
-          <w:color w:val="000000"/>
-          <w:sz w:val="30"/>
-          <w:szCs w:val="30"/>
-          <w:rtl/>
-        </w:rPr>
-        <w:t xml:space="preserve">كلمة أخيرة</w:t>
-      </w:r>
-    </w:p>
-    <w:p>
-      <w:pPr>
-        <w:bidi/>
-        <w:rPr>
-          <w:rFonts w:ascii="Sakkal Majalla" w:hAnsi="Sakkal Majalla" w:cs="Sakkal Majalla"/>
-        </w:rPr>
-      </w:pPr>
-      <w:r>
-        <w:rPr>
-          <w:rFonts w:ascii="Sakkal Majalla" w:hAnsi="Sakkal Majalla" w:cs="Sakkal Majalla"/>
-          <w:b/>
-          <w:bCs/>
-          <w:color w:val="156082"/>
-          <w:sz w:val="30"/>
-          <w:szCs w:val="30"/>
-          <w:rtl/>
-        </w:rPr>
-        <w:t xml:space="preserve">الملاحق</w:t>
-      </w:r>
-    </w:p>
-    <w:p>
-      <w:pPr>
-        <w:bidi/>
-        <w:rPr>
-          <w:rFonts w:ascii="Sakkal Majalla" w:hAnsi="Sakkal Majalla" w:cs="Sakkal Majalla"/>
-        </w:rPr>
-      </w:pPr>
-      <w:r>
-        <w:rPr>
-          <w:rFonts w:ascii="Sakkal Majalla" w:hAnsi="Sakkal Majalla" w:cs="Sakkal Majalla"/>
-          <w:color w:val="000000"/>
-          <w:sz w:val="30"/>
-          <w:szCs w:val="30"/>
-          <w:rtl/>
-        </w:rPr>
-        <w:t xml:space="preserve">الملحق الأول: خريطة الكتاب</w:t>
-      </w:r>
-    </w:p>
-    <w:p>
-      <w:pPr>
-        <w:bidi/>
-        <w:rPr>
-          <w:rFonts w:ascii="Sakkal Majalla" w:hAnsi="Sakkal Majalla" w:cs="Sakkal Majalla"/>
-        </w:rPr>
-      </w:pPr>
-      <w:r>
-        <w:rPr>
-          <w:rFonts w:ascii="Sakkal Majalla" w:hAnsi="Sakkal Majalla" w:cs="Sakkal Majalla"/>
-          <w:color w:val="000000"/>
-          <w:sz w:val="30"/>
-          <w:szCs w:val="30"/>
-          <w:rtl/>
-        </w:rPr>
-        <w:t xml:space="preserve">الملحق الثاني: معجم الأركان الثلاثة عشر</w:t>
-      </w:r>
-    </w:p>
-    <w:p>
-      <w:pPr>
-        <w:bidi/>
-        <w:rPr>
-          <w:rFonts w:ascii="Sakkal Majalla" w:hAnsi="Sakkal Majalla" w:cs="Sakkal Majalla"/>
-        </w:rPr>
-      </w:pPr>
-      <w:r>
-        <w:rPr>
-          <w:rFonts w:ascii="Sakkal Majalla" w:hAnsi="Sakkal Majalla" w:cs="Sakkal Majalla"/>
-          <w:color w:val="000000"/>
-          <w:sz w:val="30"/>
-          <w:szCs w:val="30"/>
-          <w:rtl/>
-        </w:rPr>
-        <w:t xml:space="preserve">الملحق الثالث: ثمانية نماذج عمل</w:t>
-      </w:r>
-    </w:p>
-    <w:p>
-      <w:pPr>
-        <w:bidi/>
-        <w:rPr>
-          <w:rFonts w:ascii="Sakkal Majalla" w:hAnsi="Sakkal Majalla" w:cs="Sakkal Majalla"/>
-        </w:rPr>
-      </w:pPr>
-      <w:r>
-        <w:rPr>
-          <w:rFonts w:ascii="Sakkal Majalla" w:hAnsi="Sakkal Majalla" w:cs="Sakkal Majalla"/>
-          <w:color w:val="000000"/>
-          <w:sz w:val="30"/>
-          <w:szCs w:val="30"/>
-          <w:rtl/>
-        </w:rPr>
-        <w:t xml:space="preserve">الملحق الرابع: عشرة مبادئ عملية</w:t>
-      </w:r>
-    </w:p>
-    <w:p>
-      <w:pPr>
-        <w:bidi/>
-        <w:rPr>
-          <w:rFonts w:ascii="Sakkal Majalla" w:hAnsi="Sakkal Majalla" w:cs="Sakkal Majalla"/>
-        </w:rPr>
-      </w:pPr>
-      <w:r>
-        <w:rPr>
-          <w:rFonts w:ascii="Sakkal Majalla" w:hAnsi="Sakkal Majalla" w:cs="Sakkal Majalla"/>
-          <w:color w:val="000000"/>
-          <w:sz w:val="30"/>
-          <w:szCs w:val="30"/>
-          <w:rtl/>
-        </w:rPr>
-        <w:t xml:space="preserve">الملحق الخامس: التشخيص الذاتي لمراحل التطبيق</w:t>
-      </w:r>
-    </w:p>
-    <w:p>
-      <w:pPr>
-        <w:bidi/>
-        <w:rPr>
-          <w:rFonts w:ascii="Sakkal Majalla" w:hAnsi="Sakkal Majalla" w:cs="Sakkal Majalla"/>
-        </w:rPr>
-      </w:pPr>
-      <w:r>
-        <w:rPr>
-          <w:rFonts w:ascii="Sakkal Majalla" w:hAnsi="Sakkal Majalla" w:cs="Sakkal Majalla"/>
-          <w:color w:val="000000"/>
-          <w:sz w:val="30"/>
-          <w:szCs w:val="30"/>
-          <w:rtl/>
-        </w:rPr>
-        <w:t xml:space="preserve">الملحق السادس: خطة تسعين يومًا</w:t>
-      </w:r>
-    </w:p>
-    <w:p>
-      <w:pPr>
-        <w:bidi/>
-        <w:rPr>
-          <w:rFonts w:ascii="Sakkal Majalla" w:hAnsi="Sakkal Majalla" w:cs="Sakkal Majalla"/>
-        </w:rPr>
-      </w:pPr>
-      <w:r>
-        <w:rPr>
-          <w:rFonts w:ascii="Sakkal Majalla" w:hAnsi="Sakkal Majalla" w:cs="Sakkal Majalla"/>
-          <w:color w:val="000000"/>
-          <w:sz w:val="30"/>
-          <w:szCs w:val="30"/>
-          <w:rtl/>
-        </w:rPr>
-        <w:t xml:space="preserve">الملحق السابع: ثلاثة سيناريوهات تطبيقية</w:t>
-      </w:r>
-    </w:p>
-    <w:p>
-      <w:pPr>
-        <w:bidi/>
-        <w:rPr>
-          <w:rFonts w:ascii="Sakkal Majalla" w:hAnsi="Sakkal Majalla" w:cs="Sakkal Majalla"/>
-        </w:rPr>
-      </w:pPr>
-      <w:r>
-        <w:rPr>
-          <w:rFonts w:ascii="Sakkal Majalla" w:hAnsi="Sakkal Majalla" w:cs="Sakkal Majalla"/>
-          <w:color w:val="000000"/>
-          <w:sz w:val="30"/>
-          <w:szCs w:val="30"/>
-          <w:rtl/>
-        </w:rPr>
-        <w:t xml:space="preserve">الملحق الثامن: أسئلة شائعة</w:t>
-      </w:r>
-    </w:p>
-    <w:p>
-      <w:pPr>
-        <w:bidi/>
-        <w:rPr>
-          <w:rFonts w:ascii="Sakkal Majalla" w:hAnsi="Sakkal Majalla" w:cs="Sakkal Majalla"/>
-        </w:rPr>
-      </w:pPr>
-      <w:r>
-        <w:rPr>
-          <w:rFonts w:ascii="Sakkal Majalla" w:hAnsi="Sakkal Majalla" w:cs="Sakkal Majalla"/>
-          <w:color w:val="000000"/>
-          <w:sz w:val="30"/>
-          <w:szCs w:val="30"/>
-          <w:rtl/>
-        </w:rPr>
-        <w:t xml:space="preserve">الملحق التاسع: دليل المدرب</w:t>
-      </w:r>
-    </w:p>
-    <w:p>
-      <w:pPr>
-        <w:bidi/>
-        <w:rPr>
-          <w:rFonts w:ascii="Sakkal Majalla" w:hAnsi="Sakkal Majalla" w:cs="Sakkal Majalla"/>
-        </w:rPr>
-      </w:pPr>
-      <w:r>
-        <w:rPr>
-          <w:rFonts w:ascii="Sakkal Majalla" w:hAnsi="Sakkal Majalla" w:cs="Sakkal Majalla"/>
-          <w:color w:val="000000"/>
-          <w:sz w:val="30"/>
-          <w:szCs w:val="30"/>
-          <w:rtl/>
-        </w:rPr>
-        <w:t xml:space="preserve">الملحق العاشر: متابعة الأثر</w:t>
-      </w:r>
-    </w:p>
-    <w:p>
-      <w:pPr>
-        <w:bidi/>
-        <w:rPr>
-          <w:rFonts w:ascii="Sakkal Majalla" w:hAnsi="Sakkal Majalla" w:cs="Sakkal Majalla"/>
-        </w:rPr>
-      </w:pPr>
-      <w:r>
-        <w:rPr>
-          <w:rFonts w:ascii="Sakkal Majalla" w:hAnsi="Sakkal Majalla" w:cs="Sakkal Majalla"/>
-          <w:color w:val="000000"/>
-          <w:sz w:val="30"/>
-          <w:szCs w:val="30"/>
-          <w:rtl/>
-        </w:rPr>
-        <w:t xml:space="preserve">الملحق الحادي عشر: مصفوفة الأركان والسياقات</w:t>
-      </w:r>
-    </w:p>
-    <w:p>
-      <w:pPr>
-        <w:bidi/>
-        <w:rPr>
-          <w:rFonts w:ascii="Sakkal Majalla" w:hAnsi="Sakkal Majalla" w:cs="Sakkal Majalla"/>
-        </w:rPr>
-      </w:pPr>
-      <w:r>
-        <w:rPr>
-          <w:rFonts w:ascii="Sakkal Majalla" w:hAnsi="Sakkal Majalla" w:cs="Sakkal Majalla"/>
-          <w:color w:val="000000"/>
-          <w:sz w:val="30"/>
-          <w:szCs w:val="30"/>
-          <w:rtl/>
-        </w:rPr>
-        <w:t xml:space="preserve">الملحق الثاني عشر: معجم المصطلحات</w:t>
-      </w:r>
-    </w:p>
-    <w:p>
-      <w:pPr>
-        <w:bidi/>
-        <w:rPr>
-          <w:rFonts w:ascii="Sakkal Majalla" w:hAnsi="Sakkal Majalla" w:cs="Sakkal Majalla"/>
-        </w:rPr>
-      </w:pPr>
-      <w:r>
-        <w:rPr>
-          <w:rFonts w:ascii="Sakkal Majalla" w:hAnsi="Sakkal Majalla" w:cs="Sakkal Majalla"/>
-          <w:b/>
-          <w:bCs/>
-          <w:color w:val="156082"/>
-          <w:sz w:val="30"/>
-          <w:szCs w:val="30"/>
-          <w:rtl/>
-        </w:rPr>
-        <w:t xml:space="preserve">الفهارس</w:t>
-      </w:r>
-    </w:p>
-    <w:p>
-      <w:pPr>
-        <w:bidi/>
-        <w:rPr>
-          <w:rFonts w:ascii="Sakkal Majalla" w:hAnsi="Sakkal Majalla" w:cs="Sakkal Majalla"/>
-        </w:rPr>
-      </w:pPr>
-      <w:r>
-        <w:rPr>
-          <w:rFonts w:ascii="Sakkal Majalla" w:hAnsi="Sakkal Majalla" w:cs="Sakkal Majalla"/>
-          <w:color w:val="000000"/>
-          <w:sz w:val="30"/>
-          <w:szCs w:val="30"/>
-          <w:rtl/>
-        </w:rPr>
-        <w:t xml:space="preserve">فهرس الآيات القرآنية</w:t>
-      </w:r>
-    </w:p>
-    <w:p>
-      <w:pPr>
-        <w:bidi/>
-        <w:rPr>
-          <w:rFonts w:ascii="Sakkal Majalla" w:hAnsi="Sakkal Majalla" w:cs="Sakkal Majalla"/>
-        </w:rPr>
-      </w:pPr>
-      <w:r>
-        <w:rPr>
-          <w:rFonts w:ascii="Sakkal Majalla" w:hAnsi="Sakkal Majalla" w:cs="Sakkal Majalla"/>
-          <w:color w:val="000000"/>
-          <w:sz w:val="30"/>
-          <w:szCs w:val="30"/>
-          <w:rtl/>
-        </w:rPr>
-        <w:t xml:space="preserve">فهرس الأحاديث والآثار</w:t>
-      </w:r>
-    </w:p>
-    <w:p>
-      <w:pPr>
-        <w:bidi/>
-        <w:rPr>
-          <w:rFonts w:ascii="Sakkal Majalla" w:hAnsi="Sakkal Majalla" w:cs="Sakkal Majalla"/>
-        </w:rPr>
-      </w:pPr>
-      <w:r>
-        <w:rPr>
-          <w:rFonts w:ascii="Sakkal Majalla" w:hAnsi="Sakkal Majalla" w:cs="Sakkal Majalla"/>
-          <w:color w:val="000000"/>
-          <w:sz w:val="30"/>
-          <w:szCs w:val="30"/>
-          <w:rtl/>
-        </w:rPr>
-        <w:t xml:space="preserve">قائمة المراجع الموحدة</w:t>
-      </w:r>
-    </w:p>
-    <w:p>
-      <w:pPr>
-        <w:spacing w:after="160" w:line="278" w:lineRule="auto"/>
-        <w:rPr>
-          <w:rFonts w:ascii="Sakkal Majalla" w:hAnsi="Sakkal Majalla" w:cs="Sakkal Majalla"/>
-          <w:rtl/>
-        </w:rPr>
-      </w:pPr>
-      <w:r>
-        <w:rPr>
-          <w:rFonts w:ascii="Sakkal Majalla" w:hAnsi="Sakkal Majalla" w:cs="Sakkal Majalla"/>
-          <w:rtl/>
-        </w:rPr>
-        <w:br w:type="page"/>
       </w:r>
     </w:p>
     <w:p>
@@ -4347,7 +314,7 @@
                 <w:szCs w:val="28"/>
                 <w:rtl/>
               </w:rPr>
-              <w:t xml:space="preserve">افتتاح الفصل الثامن، 8.2، 8.10، 8.12، 11.4، 11.11</w:t>
+              <w:t xml:space="preserve">افتتاح الفصل الثامن، 8.2، 8.10، 11.4، 11.11</w:t>
             </w:r>
           </w:p>
         </w:tc>
@@ -5301,7 +1268,7 @@
                 <w:szCs w:val="28"/>
                 <w:rtl/>
               </w:rPr>
-              <w:t xml:space="preserve">افتتاح الفصل العاشر، 10.3، 10.5، 10.9، 10.12</w:t>
+              <w:t xml:space="preserve">افتتاح الفصل العاشر، 10.3، 10.5، 10.9</w:t>
             </w:r>
           </w:p>
         </w:tc>
@@ -5619,7 +1586,7 @@
                 <w:szCs w:val="28"/>
                 <w:rtl/>
               </w:rPr>
-              <w:t xml:space="preserve">افتتاح الفصل الثامن، 8.3، 8.12</w:t>
+              <w:t xml:space="preserve">افتتاح الفصل الثامن، 8.3</w:t>
             </w:r>
           </w:p>
         </w:tc>
@@ -5725,7 +1692,7 @@
                 <w:szCs w:val="28"/>
                 <w:rtl/>
               </w:rPr>
-              <w:t xml:space="preserve">6.3، 6.11، 6.12</w:t>
+              <w:t xml:space="preserve">6.3، 6.11</w:t>
             </w:r>
           </w:p>
         </w:tc>
@@ -5937,7 +1904,7 @@
                 <w:szCs w:val="28"/>
                 <w:rtl/>
               </w:rPr>
-              <w:t xml:space="preserve">3.8، 4.1، 5.6، 6.4، 7.5، 10.2، 10.5، افتتاح الفصل الثاني عشر، 12.4، 12.5، 12.12</w:t>
+              <w:t xml:space="preserve">3.8، 4.1، 5.6، 6.4، 7.5، 10.2، 10.5، افتتاح الفصل الثاني عشر، 12.4، 12.5</w:t>
             </w:r>
           </w:p>
         </w:tc>
@@ -8269,7 +4236,7 @@
                 <w:szCs w:val="28"/>
                 <w:rtl/>
               </w:rPr>
-              <w:t xml:space="preserve">افتتاح الفصل العاشر، 10.4، 10.5، 10.9، 10.12</w:t>
+              <w:t xml:space="preserve">افتتاح الفصل العاشر، 10.4، 10.5، 10.9</w:t>
             </w:r>
           </w:p>
         </w:tc>
@@ -8799,7 +4766,7 @@
                 <w:szCs w:val="28"/>
                 <w:rtl/>
               </w:rPr>
-              <w:t xml:space="preserve">11.3، 11.4، 11.14</w:t>
+              <w:t xml:space="preserve">11.3، 11.4</w:t>
             </w:r>
           </w:p>
         </w:tc>
@@ -9329,7 +5296,7 @@
                 <w:szCs w:val="28"/>
                 <w:rtl/>
               </w:rPr>
-              <w:t xml:space="preserve">3.8، 4.7، 6.4، 6.7، 6.12، 10.5</w:t>
+              <w:t xml:space="preserve">3.8، 4.7، 6.4، 6.7، 10.5</w:t>
             </w:r>
           </w:p>
         </w:tc>
@@ -10177,7 +6144,7 @@
                 <w:szCs w:val="28"/>
                 <w:rtl/>
               </w:rPr>
-              <w:t xml:space="preserve">افتتاح الفصل الثالث عشر، 13.3، 13.12</w:t>
+              <w:t xml:space="preserve">افتتاح الفصل الثالث عشر، 13.3</w:t>
             </w:r>
           </w:p>
         </w:tc>
@@ -10495,7 +6462,7 @@
                 <w:szCs w:val="28"/>
                 <w:rtl/>
               </w:rPr>
-              <w:t xml:space="preserve">افتتاح الفصل العاشر، 10.2، 10.5، 10.9، 10.12</w:t>
+              <w:t xml:space="preserve">افتتاح الفصل العاشر، 10.2، 10.5، 10.9</w:t>
             </w:r>
           </w:p>
         </w:tc>
@@ -11237,7 +7204,7 @@
                 <w:szCs w:val="28"/>
                 <w:rtl/>
               </w:rPr>
-              <w:t xml:space="preserve">افتتاح الفصل التاسع، 9.2، 9.11</w:t>
+              <w:t xml:space="preserve">افتتاح الفصل التاسع، 9.2</w:t>
             </w:r>
           </w:p>
         </w:tc>
@@ -12509,7 +8476,7 @@
                 <w:szCs w:val="28"/>
                 <w:rtl/>
               </w:rPr>
-              <w:t xml:space="preserve">13.3، 13.12</w:t>
+              <w:t xml:space="preserve">13.3</w:t>
             </w:r>
           </w:p>
         </w:tc>
@@ -12827,7 +8794,7 @@
                 <w:szCs w:val="28"/>
                 <w:rtl/>
               </w:rPr>
-              <w:t xml:space="preserve">افتتاح الفصل التاسع، 9.4، 9.11</w:t>
+              <w:t xml:space="preserve">افتتاح الفصل التاسع، 9.4</w:t>
             </w:r>
           </w:p>
         </w:tc>
@@ -13039,7 +9006,7 @@
                 <w:szCs w:val="28"/>
                 <w:rtl/>
               </w:rPr>
-              <w:t xml:space="preserve">افتتاح الفصل التاسع، 9.3، 9.11</w:t>
+              <w:t xml:space="preserve">افتتاح الفصل التاسع، 9.3</w:t>
             </w:r>
           </w:p>
         </w:tc>
@@ -13251,7 +9218,7 @@
                 <w:szCs w:val="28"/>
                 <w:rtl/>
               </w:rPr>
-              <w:t xml:space="preserve">11.3، 11.14</w:t>
+              <w:t xml:space="preserve">11.3</w:t>
             </w:r>
           </w:p>
         </w:tc>
@@ -13887,7 +9854,7 @@
                 <w:szCs w:val="28"/>
                 <w:rtl/>
               </w:rPr>
-              <w:t xml:space="preserve">6.7، افتتاح الفصل الثامن، 8.4، 8.12، افتتاح الفصل الرابع عشر</w:t>
+              <w:t xml:space="preserve">6.7، افتتاح الفصل الثامن، 8.4، افتتاح الفصل الرابع عشر</w:t>
             </w:r>
           </w:p>
         </w:tc>
@@ -14311,7 +10278,7 @@
                 <w:szCs w:val="28"/>
                 <w:rtl/>
               </w:rPr>
-              <w:t xml:space="preserve">11.6، 11.14</w:t>
+              <w:t xml:space="preserve">11.6</w:t>
             </w:r>
           </w:p>
         </w:tc>
@@ -14395,7 +10362,7 @@
           <w:szCs w:val="30"/>
           <w:rtl/>
         </w:rPr>
-        <w:t xml:space="preserve">الأحاديث مرتبة بحسب أول ورودها في الكتاب، والتخريج هو ما ذكره الكتاب في موضعه. والمطابقة بالطبعات المعتمدة مسجلة في قائمة المواضع التي تحتاج مطابقة.</w:t>
+        <w:t xml:space="preserve">الأحاديث مرتبة بحسب أول ورودها في الكتاب، والتخريج هو ما ذكره الكتاب في موضعه.</w:t>
       </w:r>
     </w:p>
     <w:tbl>
@@ -18643,17 +14610,7 @@
     <w:p>
       <w:pPr>
         <w:bidi/>
-        <w:rPr>
-          <w:rFonts w:ascii="Sakkal Majalla" w:hAnsi="Sakkal Majalla" w:cs="Sakkal Majalla"/>
-        </w:rPr>
-      </w:pPr>
-    </w:p>
-    <w:p>
-      <w:pPr>
-        <w:pBdr>
-          <w:bottom w:val="single" w:sz="8" w:space="0" w:color="BF8F00"/>
-        </w:pBdr>
-        <w:bidi/>
+        <w:jc w:val="center"/>
         <w:rPr>
           <w:rFonts w:ascii="Sakkal Majalla" w:hAnsi="Sakkal Majalla" w:cs="Sakkal Majalla"/>
         </w:rPr>
@@ -18664,20 +14621,12 @@
           <w:b/>
           <w:bCs/>
           <w:color w:val="1F3864"/>
-          <w:sz w:val="34"/>
-          <w:szCs w:val="34"/>
+          <w:sz w:val="44"/>
+          <w:szCs w:val="44"/>
           <w:rtl/>
         </w:rPr>
-        <w:t xml:space="preserve">قائمة المراجع الموحدة</w:t>
-      </w:r>
-    </w:p>
-    <w:p>
-      <w:pPr>
-        <w:bidi/>
-        <w:rPr>
-          <w:rFonts w:ascii="Sakkal Majalla" w:hAnsi="Sakkal Majalla" w:cs="Sakkal Majalla"/>
-        </w:rPr>
-      </w:pPr>
+        <w:t xml:space="preserve">قائمة المراجع</w:t>
+      </w:r>
     </w:p>
     <w:p>
       <w:pPr>
@@ -18694,7 +14643,7 @@
           <w:szCs w:val="30"/>
           <w:rtl/>
         </w:rPr>
-        <w:t xml:space="preserve">هذه القائمة تجمع ما ورد في قوائم مراجع الفصول الأربعة عشر، بعد حذف المكرر وتوحيد بيانات النشر. وتبقى قائمة كل فصل في آخره لمن يريد مراجع موضع بعينه.</w:t>
+        <w:t xml:space="preserve">تجمع هذه القائمة مراجع الفصول الأربعة عشر في موضع واحد، بعد حذف المكرر وتوحيد بيانات النشر، مرتبةً بحسب نوع المصدر. وتُذكر المراجع في متن الفصول باسم المؤلف وسنة النشر.</w:t>
       </w:r>
     </w:p>
     <w:p>

</xml_diff>